<commit_message>
Regenerate bio_1_3 and bio_1_4 docx with Sub-Strand Content row
</commit_message>
<xml_diff>
--- a/data/outputs/docx/Grade 10 Bio/Bio 1.3/Biology_CellStructure_CBE_LessonSequence.docx
+++ b/data/outputs/docx/Grade 10 Bio/Bio 1.3/Biology_CellStructure_CBE_LessonSequence.docx
@@ -459,6 +459,173 @@
                 <w:sz w:val="18"/>
                 <w:szCs w:val="18"/>
               </w:rPr>
+              <w:t xml:space="preserve">Sub-Strand Content</w:t>
+            </w:r>
+          </w:p>
+        </w:tc>
+        <w:tc>
+          <w:tcPr>
+            <w:tcW w:type="dxa" w:w="10680"/>
+            <w:shd w:fill="FFFFFF" w:color="auto" w:val="clear"/>
+            <w:tcMar>
+              <w:top w:type="dxa" w:w="60"/>
+              <w:left w:type="dxa" w:w="120"/>
+              <w:bottom w:type="dxa" w:w="60"/>
+              <w:right w:type="dxa" w:w="120"/>
+            </w:tcMar>
+            <w:vAlign w:val="top"/>
+          </w:tcPr>
+          <w:p>
+            <w:pPr>
+              <w:spacing w:after="30" w:before="0"/>
+              <w:ind w:left="360" w:hanging="180"/>
+              <w:jc w:val="left"/>
+            </w:pPr>
+            <w:r>
+              <w:rPr>
+                <w:rFonts w:ascii="Arial" w:cs="Arial" w:eastAsia="Arial" w:hAnsi="Arial"/>
+                <w:b w:val="false"/>
+                <w:bCs w:val="false"/>
+                <w:i w:val="false"/>
+                <w:iCs w:val="false"/>
+                <w:color w:val="000000"/>
+                <w:sz w:val="18"/>
+                <w:szCs w:val="18"/>
+              </w:rPr>
+              <w:t xml:space="preserve">–  Microscopy: comparison of the light microscope and the electron microscope (magnification and resolution)</w:t>
+            </w:r>
+          </w:p>
+          <w:p>
+            <w:pPr>
+              <w:spacing w:after="30" w:before="0"/>
+              <w:ind w:left="360" w:hanging="180"/>
+              <w:jc w:val="left"/>
+            </w:pPr>
+            <w:r>
+              <w:rPr>
+                <w:rFonts w:ascii="Arial" w:cs="Arial" w:eastAsia="Arial" w:hAnsi="Arial"/>
+                <w:b w:val="false"/>
+                <w:bCs w:val="false"/>
+                <w:i w:val="false"/>
+                <w:iCs w:val="false"/>
+                <w:color w:val="000000"/>
+                <w:sz w:val="18"/>
+                <w:szCs w:val="18"/>
+              </w:rPr>
+              <w:t xml:space="preserve">–  Preparation and observation of temporary slides of plant cells</w:t>
+            </w:r>
+          </w:p>
+          <w:p>
+            <w:pPr>
+              <w:spacing w:after="30" w:before="0"/>
+              <w:ind w:left="360" w:hanging="180"/>
+              <w:jc w:val="left"/>
+            </w:pPr>
+            <w:r>
+              <w:rPr>
+                <w:rFonts w:ascii="Arial" w:cs="Arial" w:eastAsia="Arial" w:hAnsi="Arial"/>
+                <w:b w:val="false"/>
+                <w:bCs w:val="false"/>
+                <w:i w:val="false"/>
+                <w:iCs w:val="false"/>
+                <w:color w:val="000000"/>
+                <w:sz w:val="18"/>
+                <w:szCs w:val="18"/>
+              </w:rPr>
+              <w:t xml:space="preserve">–  Cell structure: organelles and their functions as seen under the electron microscope</w:t>
+            </w:r>
+          </w:p>
+          <w:p>
+            <w:pPr>
+              <w:spacing w:after="30" w:before="0"/>
+              <w:ind w:left="360" w:hanging="180"/>
+              <w:jc w:val="left"/>
+            </w:pPr>
+            <w:r>
+              <w:rPr>
+                <w:rFonts w:ascii="Arial" w:cs="Arial" w:eastAsia="Arial" w:hAnsi="Arial"/>
+                <w:b w:val="false"/>
+                <w:bCs w:val="false"/>
+                <w:i w:val="false"/>
+                <w:iCs w:val="false"/>
+                <w:color w:val="000000"/>
+                <w:sz w:val="18"/>
+                <w:szCs w:val="18"/>
+              </w:rPr>
+              <w:t xml:space="preserve">–  Comparison of plant and animal cells</w:t>
+            </w:r>
+          </w:p>
+          <w:p>
+            <w:pPr>
+              <w:spacing w:after="30" w:before="0"/>
+              <w:ind w:left="360" w:hanging="180"/>
+              <w:jc w:val="left"/>
+            </w:pPr>
+            <w:r>
+              <w:rPr>
+                <w:rFonts w:ascii="Arial" w:cs="Arial" w:eastAsia="Arial" w:hAnsi="Arial"/>
+                <w:b w:val="false"/>
+                <w:bCs w:val="false"/>
+                <w:i w:val="false"/>
+                <w:iCs w:val="false"/>
+                <w:color w:val="000000"/>
+                <w:sz w:val="18"/>
+                <w:szCs w:val="18"/>
+              </w:rPr>
+              <w:t xml:space="preserve">–  Cell specialisation: how the structure of specialised plant and animal cells serves their function</w:t>
+            </w:r>
+          </w:p>
+          <w:p>
+            <w:pPr>
+              <w:spacing w:after="30" w:before="0"/>
+              <w:ind w:left="360" w:hanging="180"/>
+              <w:jc w:val="left"/>
+            </w:pPr>
+            <w:r>
+              <w:rPr>
+                <w:rFonts w:ascii="Arial" w:cs="Arial" w:eastAsia="Arial" w:hAnsi="Arial"/>
+                <w:b w:val="false"/>
+                <w:bCs w:val="false"/>
+                <w:i w:val="false"/>
+                <w:iCs w:val="false"/>
+                <w:color w:val="000000"/>
+                <w:sz w:val="18"/>
+                <w:szCs w:val="18"/>
+              </w:rPr>
+              <w:t xml:space="preserve">–  Levels of organisation: cell, tissue, organ, organ system, organism</w:t>
+            </w:r>
+          </w:p>
+        </w:tc>
+      </w:tr>
+      <w:tr>
+        <w:tc>
+          <w:tcPr>
+            <w:tcW w:type="dxa" w:w="3000"/>
+            <w:shd w:fill="D5E8F0" w:color="auto" w:val="clear"/>
+            <w:tcMar>
+              <w:top w:type="dxa" w:w="60"/>
+              <w:left w:type="dxa" w:w="120"/>
+              <w:bottom w:type="dxa" w:w="60"/>
+              <w:right w:type="dxa" w:w="120"/>
+            </w:tcMar>
+            <w:vAlign w:val="top"/>
+          </w:tcPr>
+          <w:p>
+            <w:pPr>
+              <w:spacing w:after="40" w:before="0"/>
+              <w:jc w:val="left"/>
+            </w:pPr>
+            <w:r>
+              <w:rPr>
+                <w:rFonts w:ascii="Arial" w:cs="Arial" w:eastAsia="Arial" w:hAnsi="Arial"/>
+                <w:b/>
+                <w:bCs/>
+                <w:i w:val="false"/>
+                <w:iCs w:val="false"/>
+                <w:color w:val="000000"/>
+                <w:sz w:val="18"/>
+                <w:szCs w:val="18"/>
+              </w:rPr>
               <w:t xml:space="preserve">Learning Outcomes</w:t>
             </w:r>
           </w:p>
@@ -3092,11 +3259,11 @@
       </w:tblPr>
       <w:tblGrid>
         <w:gridCol w:w="900"/>
+        <w:gridCol w:w="2300"/>
         <w:gridCol w:w="2556"/>
-        <w:gridCol w:w="2556"/>
-        <w:gridCol w:w="2556"/>
-        <w:gridCol w:w="2556"/>
-        <w:gridCol w:w="2556"/>
+        <w:gridCol w:w="3324"/>
+        <w:gridCol w:w="2300"/>
+        <w:gridCol w:w="2300"/>
       </w:tblGrid>
       <w:tr>
         <w:tc>
@@ -3168,7 +3335,7 @@
         </w:tc>
         <w:tc>
           <w:tcPr>
-            <w:tcW w:type="dxa" w:w="2556"/>
+            <w:tcW w:type="dxa" w:w="2300"/>
             <w:shd w:fill="2E75B6" w:color="auto" w:val="clear"/>
             <w:tcMar>
               <w:top w:type="dxa" w:w="60"/>
@@ -3232,7 +3399,7 @@
         </w:tc>
         <w:tc>
           <w:tcPr>
-            <w:tcW w:type="dxa" w:w="2556"/>
+            <w:tcW w:type="dxa" w:w="3324"/>
             <w:shd w:fill="2E75B6" w:color="auto" w:val="clear"/>
             <w:tcMar>
               <w:top w:type="dxa" w:w="60"/>
@@ -3264,7 +3431,7 @@
         </w:tc>
         <w:tc>
           <w:tcPr>
-            <w:tcW w:type="dxa" w:w="2556"/>
+            <w:tcW w:type="dxa" w:w="2300"/>
             <w:shd w:fill="1F6B75" w:color="auto" w:val="clear"/>
             <w:tcMar>
               <w:top w:type="dxa" w:w="60"/>
@@ -3296,7 +3463,7 @@
         </w:tc>
         <w:tc>
           <w:tcPr>
-            <w:tcW w:type="dxa" w:w="2556"/>
+            <w:tcW w:type="dxa" w:w="2300"/>
             <w:shd w:fill="2E75B6" w:color="auto" w:val="clear"/>
             <w:tcMar>
               <w:top w:type="dxa" w:w="60"/>
@@ -3362,7 +3529,7 @@
         </w:tc>
         <w:tc>
           <w:tcPr>
-            <w:tcW w:type="dxa" w:w="2556"/>
+            <w:tcW w:type="dxa" w:w="2300"/>
             <w:shd w:fill="FFFFFF" w:color="auto" w:val="clear"/>
             <w:tcMar>
               <w:top w:type="dxa" w:w="60"/>
@@ -3424,7 +3591,7 @@
             <w:pPr>
               <w:spacing w:after="20" w:before="0"/>
             </w:pPr>
-            <w:hyperlink w:history="1" r:id="rIdgej_al94ewnjtblq5xsxk">
+            <w:hyperlink w:history="1" r:id="rId9cyio7beau0phjz2xpimp">
               <w:r>
                 <w:rPr>
                   <w:rFonts w:ascii="Arial" w:cs="Arial" w:eastAsia="Arial" w:hAnsi="Arial"/>
@@ -3457,7 +3624,7 @@
               <w:spacing w:after="10" w:before="0"/>
               <w:ind w:left="120"/>
             </w:pPr>
-            <w:hyperlink w:history="1" r:id="rIdppv4zmvffxbin5sm_0uee">
+            <w:hyperlink w:history="1" r:id="rIdvrb7bxkrafcjwvm0opg-r">
               <w:r>
                 <w:rPr>
                   <w:rFonts w:ascii="Arial" w:cs="Arial" w:eastAsia="Arial" w:hAnsi="Arial"/>
@@ -3502,7 +3669,7 @@
             <w:pPr>
               <w:spacing w:after="20" w:before="0"/>
             </w:pPr>
-            <w:hyperlink w:history="1" r:id="rIdxsv7l5t-lgvvjz7vxt6jk">
+            <w:hyperlink w:history="1" r:id="rIdurdcfwfixuotaurc7aklw">
               <w:r>
                 <w:rPr>
                   <w:rFonts w:ascii="Arial" w:cs="Arial" w:eastAsia="Arial" w:hAnsi="Arial"/>
@@ -3535,7 +3702,7 @@
               <w:spacing w:after="10" w:before="0"/>
               <w:ind w:left="120"/>
             </w:pPr>
-            <w:hyperlink w:history="1" r:id="rIdlcwzzq_kxiftglydiqivi">
+            <w:hyperlink w:history="1" r:id="rIdhpiwftcdjumz0ctsmgd5v">
               <w:r>
                 <w:rPr>
                   <w:rFonts w:ascii="Arial" w:cs="Arial" w:eastAsia="Arial" w:hAnsi="Arial"/>
@@ -3551,7 +3718,7 @@
         </w:tc>
         <w:tc>
           <w:tcPr>
-            <w:tcW w:type="dxa" w:w="2556"/>
+            <w:tcW w:type="dxa" w:w="3324"/>
             <w:shd w:fill="FFFFFF" w:color="auto" w:val="clear"/>
             <w:tcMar>
               <w:top w:type="dxa" w:w="60"/>
@@ -3640,7 +3807,7 @@
         </w:tc>
         <w:tc>
           <w:tcPr>
-            <w:tcW w:type="dxa" w:w="2556"/>
+            <w:tcW w:type="dxa" w:w="2300"/>
             <w:shd w:fill="F2F2F2" w:color="auto" w:val="clear"/>
             <w:tcMar>
               <w:top w:type="dxa" w:w="60"/>
@@ -3691,7 +3858,7 @@
         </w:tc>
         <w:tc>
           <w:tcPr>
-            <w:tcW w:type="dxa" w:w="2556"/>
+            <w:tcW w:type="dxa" w:w="2300"/>
             <w:shd w:fill="FFFFFF" w:color="auto" w:val="clear"/>
             <w:tcMar>
               <w:top w:type="dxa" w:w="60"/>
@@ -3814,7 +3981,7 @@
         </w:tc>
         <w:tc>
           <w:tcPr>
-            <w:tcW w:type="dxa" w:w="2556"/>
+            <w:tcW w:type="dxa" w:w="2300"/>
             <w:shd w:fill="FFFFFF" w:color="auto" w:val="clear"/>
             <w:tcMar>
               <w:top w:type="dxa" w:w="60"/>
@@ -3876,7 +4043,7 @@
             <w:pPr>
               <w:spacing w:after="20" w:before="0"/>
             </w:pPr>
-            <w:hyperlink w:history="1" r:id="rId9ubxfjtilpatmoy2ucjyv">
+            <w:hyperlink w:history="1" r:id="rIdaky83jlued8ilqbsrl7ow">
               <w:r>
                 <w:rPr>
                   <w:rFonts w:ascii="Arial" w:cs="Arial" w:eastAsia="Arial" w:hAnsi="Arial"/>
@@ -3909,7 +4076,7 @@
               <w:spacing w:after="10" w:before="0"/>
               <w:ind w:left="120"/>
             </w:pPr>
-            <w:hyperlink w:history="1" r:id="rIdam3cjjxvkwtb4vsfdosco">
+            <w:hyperlink w:history="1" r:id="rIdwcwrtjsxwhq8kodb-q2oo">
               <w:r>
                 <w:rPr>
                   <w:rFonts w:ascii="Arial" w:cs="Arial" w:eastAsia="Arial" w:hAnsi="Arial"/>
@@ -3954,7 +4121,7 @@
             <w:pPr>
               <w:spacing w:after="20" w:before="0"/>
             </w:pPr>
-            <w:hyperlink w:history="1" r:id="rIdznstws-zslg9p7n-oah-e">
+            <w:hyperlink w:history="1" r:id="rIdqxxaurlxtisr8fnxt292j">
               <w:r>
                 <w:rPr>
                   <w:rFonts w:ascii="Arial" w:cs="Arial" w:eastAsia="Arial" w:hAnsi="Arial"/>
@@ -3987,7 +4154,7 @@
               <w:spacing w:after="10" w:before="0"/>
               <w:ind w:left="120"/>
             </w:pPr>
-            <w:hyperlink w:history="1" r:id="rIdy7uavbaz3c9hzorejs7tm">
+            <w:hyperlink w:history="1" r:id="rId58qpthw_ek605xnoe7jci">
               <w:r>
                 <w:rPr>
                   <w:rFonts w:ascii="Arial" w:cs="Arial" w:eastAsia="Arial" w:hAnsi="Arial"/>
@@ -4003,7 +4170,7 @@
         </w:tc>
         <w:tc>
           <w:tcPr>
-            <w:tcW w:type="dxa" w:w="2556"/>
+            <w:tcW w:type="dxa" w:w="3324"/>
             <w:shd w:fill="FFFFFF" w:color="auto" w:val="clear"/>
             <w:tcMar>
               <w:top w:type="dxa" w:w="60"/>
@@ -4092,7 +4259,7 @@
         </w:tc>
         <w:tc>
           <w:tcPr>
-            <w:tcW w:type="dxa" w:w="2556"/>
+            <w:tcW w:type="dxa" w:w="2300"/>
             <w:shd w:fill="F2F2F2" w:color="auto" w:val="clear"/>
             <w:tcMar>
               <w:top w:type="dxa" w:w="60"/>
@@ -4162,7 +4329,7 @@
         </w:tc>
         <w:tc>
           <w:tcPr>
-            <w:tcW w:type="dxa" w:w="2556"/>
+            <w:tcW w:type="dxa" w:w="2300"/>
             <w:shd w:fill="FFFFFF" w:color="auto" w:val="clear"/>
             <w:tcMar>
               <w:top w:type="dxa" w:w="60"/>
@@ -4266,7 +4433,7 @@
         </w:tc>
         <w:tc>
           <w:tcPr>
-            <w:tcW w:type="dxa" w:w="2556"/>
+            <w:tcW w:type="dxa" w:w="2300"/>
             <w:shd w:fill="FFFFFF" w:color="auto" w:val="clear"/>
             <w:tcMar>
               <w:top w:type="dxa" w:w="60"/>
@@ -4328,7 +4495,7 @@
             <w:pPr>
               <w:spacing w:after="20" w:before="0"/>
             </w:pPr>
-            <w:hyperlink w:history="1" r:id="rIdmylwyvysk1svwu6sui1za">
+            <w:hyperlink w:history="1" r:id="rId-qhzcrgcuop9xvbrjgdmf">
               <w:r>
                 <w:rPr>
                   <w:rFonts w:ascii="Arial" w:cs="Arial" w:eastAsia="Arial" w:hAnsi="Arial"/>
@@ -4361,7 +4528,7 @@
               <w:spacing w:after="10" w:before="0"/>
               <w:ind w:left="120"/>
             </w:pPr>
-            <w:hyperlink w:history="1" r:id="rIdajcytvizgwco74xqwh96r">
+            <w:hyperlink w:history="1" r:id="rId5kbdjz98mpz13tzfn7pql">
               <w:r>
                 <w:rPr>
                   <w:rFonts w:ascii="Arial" w:cs="Arial" w:eastAsia="Arial" w:hAnsi="Arial"/>
@@ -4406,7 +4573,7 @@
             <w:pPr>
               <w:spacing w:after="20" w:before="0"/>
             </w:pPr>
-            <w:hyperlink w:history="1" r:id="rIdncl7fgcxsadzodxny9-uk">
+            <w:hyperlink w:history="1" r:id="rIdzi-5a0eat5zc6we8awluv">
               <w:r>
                 <w:rPr>
                   <w:rFonts w:ascii="Arial" w:cs="Arial" w:eastAsia="Arial" w:hAnsi="Arial"/>
@@ -4439,7 +4606,7 @@
               <w:spacing w:after="10" w:before="0"/>
               <w:ind w:left="120"/>
             </w:pPr>
-            <w:hyperlink w:history="1" r:id="rIdcudm9tsg3vco5-y5dt1ud">
+            <w:hyperlink w:history="1" r:id="rIdwx4yazh-ryf4u_qlsdfbu">
               <w:r>
                 <w:rPr>
                   <w:rFonts w:ascii="Arial" w:cs="Arial" w:eastAsia="Arial" w:hAnsi="Arial"/>
@@ -4455,7 +4622,7 @@
         </w:tc>
         <w:tc>
           <w:tcPr>
-            <w:tcW w:type="dxa" w:w="2556"/>
+            <w:tcW w:type="dxa" w:w="3324"/>
             <w:shd w:fill="FFFFFF" w:color="auto" w:val="clear"/>
             <w:tcMar>
               <w:top w:type="dxa" w:w="60"/>
@@ -4563,7 +4730,7 @@
         </w:tc>
         <w:tc>
           <w:tcPr>
-            <w:tcW w:type="dxa" w:w="2556"/>
+            <w:tcW w:type="dxa" w:w="2300"/>
             <w:shd w:fill="F2F2F2" w:color="auto" w:val="clear"/>
             <w:tcMar>
               <w:top w:type="dxa" w:w="60"/>
@@ -4633,7 +4800,7 @@
         </w:tc>
         <w:tc>
           <w:tcPr>
-            <w:tcW w:type="dxa" w:w="2556"/>
+            <w:tcW w:type="dxa" w:w="2300"/>
             <w:shd w:fill="FFFFFF" w:color="auto" w:val="clear"/>
             <w:tcMar>
               <w:top w:type="dxa" w:w="60"/>
@@ -4737,7 +4904,7 @@
         </w:tc>
         <w:tc>
           <w:tcPr>
-            <w:tcW w:type="dxa" w:w="2556"/>
+            <w:tcW w:type="dxa" w:w="2300"/>
             <w:shd w:fill="FFFFFF" w:color="auto" w:val="clear"/>
             <w:tcMar>
               <w:top w:type="dxa" w:w="60"/>
@@ -4799,7 +4966,7 @@
             <w:pPr>
               <w:spacing w:after="20" w:before="0"/>
             </w:pPr>
-            <w:hyperlink w:history="1" r:id="rIdm0qyitmrqyxwmbabxlob_">
+            <w:hyperlink w:history="1" r:id="rIdakypkncbicom2my-4_7fe">
               <w:r>
                 <w:rPr>
                   <w:rFonts w:ascii="Arial" w:cs="Arial" w:eastAsia="Arial" w:hAnsi="Arial"/>
@@ -4832,7 +4999,7 @@
               <w:spacing w:after="10" w:before="0"/>
               <w:ind w:left="120"/>
             </w:pPr>
-            <w:hyperlink w:history="1" r:id="rIdnrnhpomv7k2wokn2x25rd">
+            <w:hyperlink w:history="1" r:id="rIdbpeheqqkrhxamzi4lxtz3">
               <w:r>
                 <w:rPr>
                   <w:rFonts w:ascii="Arial" w:cs="Arial" w:eastAsia="Arial" w:hAnsi="Arial"/>
@@ -4877,7 +5044,7 @@
             <w:pPr>
               <w:spacing w:after="20" w:before="0"/>
             </w:pPr>
-            <w:hyperlink w:history="1" r:id="rIdxus3ljymgbd2u2bcfk-tf">
+            <w:hyperlink w:history="1" r:id="rIdtnrou1-kxtqcfyrex7rem">
               <w:r>
                 <w:rPr>
                   <w:rFonts w:ascii="Arial" w:cs="Arial" w:eastAsia="Arial" w:hAnsi="Arial"/>
@@ -4910,7 +5077,7 @@
               <w:spacing w:after="10" w:before="0"/>
               <w:ind w:left="120"/>
             </w:pPr>
-            <w:hyperlink w:history="1" r:id="rIdepxi8eawfphg6fjnaok7c">
+            <w:hyperlink w:history="1" r:id="rIdwyv__pehlvj3xi68jqo01">
               <w:r>
                 <w:rPr>
                   <w:rFonts w:ascii="Arial" w:cs="Arial" w:eastAsia="Arial" w:hAnsi="Arial"/>
@@ -4926,7 +5093,7 @@
         </w:tc>
         <w:tc>
           <w:tcPr>
-            <w:tcW w:type="dxa" w:w="2556"/>
+            <w:tcW w:type="dxa" w:w="3324"/>
             <w:shd w:fill="FFFFFF" w:color="auto" w:val="clear"/>
             <w:tcMar>
               <w:top w:type="dxa" w:w="60"/>
@@ -5015,7 +5182,7 @@
         </w:tc>
         <w:tc>
           <w:tcPr>
-            <w:tcW w:type="dxa" w:w="2556"/>
+            <w:tcW w:type="dxa" w:w="2300"/>
             <w:shd w:fill="F2F2F2" w:color="auto" w:val="clear"/>
             <w:tcMar>
               <w:top w:type="dxa" w:w="60"/>
@@ -5104,7 +5271,7 @@
         </w:tc>
         <w:tc>
           <w:tcPr>
-            <w:tcW w:type="dxa" w:w="2556"/>
+            <w:tcW w:type="dxa" w:w="2300"/>
             <w:shd w:fill="FFFFFF" w:color="auto" w:val="clear"/>
             <w:tcMar>
               <w:top w:type="dxa" w:w="60"/>
@@ -5208,7 +5375,7 @@
         </w:tc>
         <w:tc>
           <w:tcPr>
-            <w:tcW w:type="dxa" w:w="2556"/>
+            <w:tcW w:type="dxa" w:w="2300"/>
             <w:shd w:fill="FFFFFF" w:color="auto" w:val="clear"/>
             <w:tcMar>
               <w:top w:type="dxa" w:w="60"/>
@@ -5270,7 +5437,7 @@
             <w:pPr>
               <w:spacing w:after="20" w:before="0"/>
             </w:pPr>
-            <w:hyperlink w:history="1" r:id="rIdp-hwu5muj9fmkk4xzus-6">
+            <w:hyperlink w:history="1" r:id="rId0de_1fe0_v_6ye-kt1zjc">
               <w:r>
                 <w:rPr>
                   <w:rFonts w:ascii="Arial" w:cs="Arial" w:eastAsia="Arial" w:hAnsi="Arial"/>
@@ -5303,7 +5470,7 @@
               <w:spacing w:after="10" w:before="0"/>
               <w:ind w:left="120"/>
             </w:pPr>
-            <w:hyperlink w:history="1" r:id="rIdzclbrg0ke1e-hmgs3jurc">
+            <w:hyperlink w:history="1" r:id="rIdmizdsqdmrbxogcb0trccs">
               <w:r>
                 <w:rPr>
                   <w:rFonts w:ascii="Arial" w:cs="Arial" w:eastAsia="Arial" w:hAnsi="Arial"/>
@@ -5348,7 +5515,7 @@
             <w:pPr>
               <w:spacing w:after="20" w:before="0"/>
             </w:pPr>
-            <w:hyperlink w:history="1" r:id="rIdomds1xfdbhhacpuej86gt">
+            <w:hyperlink w:history="1" r:id="rIdy24wmgobf53ebaprx3tkk">
               <w:r>
                 <w:rPr>
                   <w:rFonts w:ascii="Arial" w:cs="Arial" w:eastAsia="Arial" w:hAnsi="Arial"/>
@@ -5381,7 +5548,7 @@
               <w:spacing w:after="10" w:before="0"/>
               <w:ind w:left="120"/>
             </w:pPr>
-            <w:hyperlink w:history="1" r:id="rIdpaiiag6ufe7fhujxppmwl">
+            <w:hyperlink w:history="1" r:id="rIdjhkczjdwn4_cdayne30ax">
               <w:r>
                 <w:rPr>
                   <w:rFonts w:ascii="Arial" w:cs="Arial" w:eastAsia="Arial" w:hAnsi="Arial"/>
@@ -5397,7 +5564,7 @@
         </w:tc>
         <w:tc>
           <w:tcPr>
-            <w:tcW w:type="dxa" w:w="2556"/>
+            <w:tcW w:type="dxa" w:w="3324"/>
             <w:shd w:fill="FFFFFF" w:color="auto" w:val="clear"/>
             <w:tcMar>
               <w:top w:type="dxa" w:w="60"/>
@@ -5486,7 +5653,7 @@
         </w:tc>
         <w:tc>
           <w:tcPr>
-            <w:tcW w:type="dxa" w:w="2556"/>
+            <w:tcW w:type="dxa" w:w="2300"/>
             <w:shd w:fill="F2F2F2" w:color="auto" w:val="clear"/>
             <w:tcMar>
               <w:top w:type="dxa" w:w="60"/>
@@ -5575,7 +5742,7 @@
         </w:tc>
         <w:tc>
           <w:tcPr>
-            <w:tcW w:type="dxa" w:w="2556"/>
+            <w:tcW w:type="dxa" w:w="2300"/>
             <w:shd w:fill="FFFFFF" w:color="auto" w:val="clear"/>
             <w:tcMar>
               <w:top w:type="dxa" w:w="60"/>
@@ -7215,11 +7382,11 @@
       </w:tblPr>
       <w:tblGrid>
         <w:gridCol w:w="900"/>
+        <w:gridCol w:w="2300"/>
         <w:gridCol w:w="2556"/>
-        <w:gridCol w:w="2556"/>
-        <w:gridCol w:w="2556"/>
-        <w:gridCol w:w="2556"/>
-        <w:gridCol w:w="2556"/>
+        <w:gridCol w:w="3324"/>
+        <w:gridCol w:w="2300"/>
+        <w:gridCol w:w="2300"/>
       </w:tblGrid>
       <w:tr>
         <w:tc>
@@ -7291,7 +7458,7 @@
         </w:tc>
         <w:tc>
           <w:tcPr>
-            <w:tcW w:type="dxa" w:w="2556"/>
+            <w:tcW w:type="dxa" w:w="2300"/>
             <w:shd w:fill="2E75B6" w:color="auto" w:val="clear"/>
             <w:tcMar>
               <w:top w:type="dxa" w:w="60"/>
@@ -7355,7 +7522,7 @@
         </w:tc>
         <w:tc>
           <w:tcPr>
-            <w:tcW w:type="dxa" w:w="2556"/>
+            <w:tcW w:type="dxa" w:w="3324"/>
             <w:shd w:fill="2E75B6" w:color="auto" w:val="clear"/>
             <w:tcMar>
               <w:top w:type="dxa" w:w="60"/>
@@ -7387,7 +7554,7 @@
         </w:tc>
         <w:tc>
           <w:tcPr>
-            <w:tcW w:type="dxa" w:w="2556"/>
+            <w:tcW w:type="dxa" w:w="2300"/>
             <w:shd w:fill="1F6B75" w:color="auto" w:val="clear"/>
             <w:tcMar>
               <w:top w:type="dxa" w:w="60"/>
@@ -7419,7 +7586,7 @@
         </w:tc>
         <w:tc>
           <w:tcPr>
-            <w:tcW w:type="dxa" w:w="2556"/>
+            <w:tcW w:type="dxa" w:w="2300"/>
             <w:shd w:fill="2E75B6" w:color="auto" w:val="clear"/>
             <w:tcMar>
               <w:top w:type="dxa" w:w="60"/>
@@ -7485,7 +7652,7 @@
         </w:tc>
         <w:tc>
           <w:tcPr>
-            <w:tcW w:type="dxa" w:w="2556"/>
+            <w:tcW w:type="dxa" w:w="2300"/>
             <w:shd w:fill="FFFFFF" w:color="auto" w:val="clear"/>
             <w:tcMar>
               <w:top w:type="dxa" w:w="60"/>
@@ -7547,7 +7714,7 @@
             <w:pPr>
               <w:spacing w:after="20" w:before="0"/>
             </w:pPr>
-            <w:hyperlink w:history="1" r:id="rIdkfcbnjyyixzcrulefbxca">
+            <w:hyperlink w:history="1" r:id="rIdfphvp2kdcmruwjwojs3dd">
               <w:r>
                 <w:rPr>
                   <w:rFonts w:ascii="Arial" w:cs="Arial" w:eastAsia="Arial" w:hAnsi="Arial"/>
@@ -7580,7 +7747,7 @@
               <w:spacing w:after="10" w:before="0"/>
               <w:ind w:left="120"/>
             </w:pPr>
-            <w:hyperlink w:history="1" r:id="rIda9w4emecte2d9adkcvomb">
+            <w:hyperlink w:history="1" r:id="rId60h_jfkq0hivburokz9mp">
               <w:r>
                 <w:rPr>
                   <w:rFonts w:ascii="Arial" w:cs="Arial" w:eastAsia="Arial" w:hAnsi="Arial"/>
@@ -7625,7 +7792,7 @@
             <w:pPr>
               <w:spacing w:after="20" w:before="0"/>
             </w:pPr>
-            <w:hyperlink w:history="1" r:id="rIdp3fkmmm8g6bu8ych8sy-3">
+            <w:hyperlink w:history="1" r:id="rId1zxe4mwvnfi_ush8oa6ny">
               <w:r>
                 <w:rPr>
                   <w:rFonts w:ascii="Arial" w:cs="Arial" w:eastAsia="Arial" w:hAnsi="Arial"/>
@@ -7658,7 +7825,7 @@
               <w:spacing w:after="10" w:before="0"/>
               <w:ind w:left="120"/>
             </w:pPr>
-            <w:hyperlink w:history="1" r:id="rIdi99rjh6jtiuzujcvpvqu6">
+            <w:hyperlink w:history="1" r:id="rId6xwl4haz1imuotixkgvap">
               <w:r>
                 <w:rPr>
                   <w:rFonts w:ascii="Arial" w:cs="Arial" w:eastAsia="Arial" w:hAnsi="Arial"/>
@@ -7674,7 +7841,7 @@
         </w:tc>
         <w:tc>
           <w:tcPr>
-            <w:tcW w:type="dxa" w:w="2556"/>
+            <w:tcW w:type="dxa" w:w="3324"/>
             <w:shd w:fill="FFFFFF" w:color="auto" w:val="clear"/>
             <w:tcMar>
               <w:top w:type="dxa" w:w="60"/>
@@ -7782,7 +7949,7 @@
         </w:tc>
         <w:tc>
           <w:tcPr>
-            <w:tcW w:type="dxa" w:w="2556"/>
+            <w:tcW w:type="dxa" w:w="2300"/>
             <w:shd w:fill="F2F2F2" w:color="auto" w:val="clear"/>
             <w:tcMar>
               <w:top w:type="dxa" w:w="60"/>
@@ -7852,7 +8019,7 @@
         </w:tc>
         <w:tc>
           <w:tcPr>
-            <w:tcW w:type="dxa" w:w="2556"/>
+            <w:tcW w:type="dxa" w:w="2300"/>
             <w:shd w:fill="FFFFFF" w:color="auto" w:val="clear"/>
             <w:tcMar>
               <w:top w:type="dxa" w:w="60"/>
@@ -7918,7 +8085,7 @@
         </w:tc>
         <w:tc>
           <w:tcPr>
-            <w:tcW w:type="dxa" w:w="2556"/>
+            <w:tcW w:type="dxa" w:w="2300"/>
             <w:shd w:fill="FFFFFF" w:color="auto" w:val="clear"/>
             <w:tcMar>
               <w:top w:type="dxa" w:w="60"/>
@@ -7980,7 +8147,7 @@
             <w:pPr>
               <w:spacing w:after="20" w:before="0"/>
             </w:pPr>
-            <w:hyperlink w:history="1" r:id="rIdvfcdgg4awy8n9f3ww2drd">
+            <w:hyperlink w:history="1" r:id="rIdhjgaikenawqviybxuxorm">
               <w:r>
                 <w:rPr>
                   <w:rFonts w:ascii="Arial" w:cs="Arial" w:eastAsia="Arial" w:hAnsi="Arial"/>
@@ -8013,7 +8180,7 @@
               <w:spacing w:after="10" w:before="0"/>
               <w:ind w:left="120"/>
             </w:pPr>
-            <w:hyperlink w:history="1" r:id="rIdfuangb1y1q6ixw2gm4jzt">
+            <w:hyperlink w:history="1" r:id="rIdz7rt7ijclc0qflse9381n">
               <w:r>
                 <w:rPr>
                   <w:rFonts w:ascii="Arial" w:cs="Arial" w:eastAsia="Arial" w:hAnsi="Arial"/>
@@ -8058,7 +8225,7 @@
             <w:pPr>
               <w:spacing w:after="20" w:before="0"/>
             </w:pPr>
-            <w:hyperlink w:history="1" r:id="rIdfhg565w-pn6jt_6qxmj8n">
+            <w:hyperlink w:history="1" r:id="rIduy3xtzkjkalqq79xolmrj">
               <w:r>
                 <w:rPr>
                   <w:rFonts w:ascii="Arial" w:cs="Arial" w:eastAsia="Arial" w:hAnsi="Arial"/>
@@ -8091,7 +8258,7 @@
               <w:spacing w:after="10" w:before="0"/>
               <w:ind w:left="120"/>
             </w:pPr>
-            <w:hyperlink w:history="1" r:id="rIdvqp1qkzuhkl3svhk8vshw">
+            <w:hyperlink w:history="1" r:id="rIdcrhevvlsu4teq5fmkuztj">
               <w:r>
                 <w:rPr>
                   <w:rFonts w:ascii="Arial" w:cs="Arial" w:eastAsia="Arial" w:hAnsi="Arial"/>
@@ -8107,7 +8274,7 @@
         </w:tc>
         <w:tc>
           <w:tcPr>
-            <w:tcW w:type="dxa" w:w="2556"/>
+            <w:tcW w:type="dxa" w:w="3324"/>
             <w:shd w:fill="FFFFFF" w:color="auto" w:val="clear"/>
             <w:tcMar>
               <w:top w:type="dxa" w:w="60"/>
@@ -8196,7 +8363,7 @@
         </w:tc>
         <w:tc>
           <w:tcPr>
-            <w:tcW w:type="dxa" w:w="2556"/>
+            <w:tcW w:type="dxa" w:w="2300"/>
             <w:shd w:fill="F2F2F2" w:color="auto" w:val="clear"/>
             <w:tcMar>
               <w:top w:type="dxa" w:w="60"/>
@@ -8266,7 +8433,7 @@
         </w:tc>
         <w:tc>
           <w:tcPr>
-            <w:tcW w:type="dxa" w:w="2556"/>
+            <w:tcW w:type="dxa" w:w="2300"/>
             <w:shd w:fill="FFFFFF" w:color="auto" w:val="clear"/>
             <w:tcMar>
               <w:top w:type="dxa" w:w="60"/>
@@ -8370,7 +8537,7 @@
         </w:tc>
         <w:tc>
           <w:tcPr>
-            <w:tcW w:type="dxa" w:w="2556"/>
+            <w:tcW w:type="dxa" w:w="2300"/>
             <w:shd w:fill="FFFFFF" w:color="auto" w:val="clear"/>
             <w:tcMar>
               <w:top w:type="dxa" w:w="60"/>
@@ -8432,7 +8599,7 @@
             <w:pPr>
               <w:spacing w:after="20" w:before="0"/>
             </w:pPr>
-            <w:hyperlink w:history="1" r:id="rIdxw8cssghm7-sq4jk4ut-m">
+            <w:hyperlink w:history="1" r:id="rIdwxm7ty-6m01wjbluurwyl">
               <w:r>
                 <w:rPr>
                   <w:rFonts w:ascii="Arial" w:cs="Arial" w:eastAsia="Arial" w:hAnsi="Arial"/>
@@ -8465,7 +8632,7 @@
               <w:spacing w:after="10" w:before="0"/>
               <w:ind w:left="120"/>
             </w:pPr>
-            <w:hyperlink w:history="1" r:id="rIdmavnceuly-md9lb0sb-kr">
+            <w:hyperlink w:history="1" r:id="rIdisgx26qyp_yj_ss22_cm5">
               <w:r>
                 <w:rPr>
                   <w:rFonts w:ascii="Arial" w:cs="Arial" w:eastAsia="Arial" w:hAnsi="Arial"/>
@@ -8510,7 +8677,7 @@
             <w:pPr>
               <w:spacing w:after="20" w:before="0"/>
             </w:pPr>
-            <w:hyperlink w:history="1" r:id="rIdvgjtqz7fmpgdd9jmjieu7">
+            <w:hyperlink w:history="1" r:id="rIdckt8uvhw3f5exk-eg7rtw">
               <w:r>
                 <w:rPr>
                   <w:rFonts w:ascii="Arial" w:cs="Arial" w:eastAsia="Arial" w:hAnsi="Arial"/>
@@ -8543,7 +8710,7 @@
               <w:spacing w:after="10" w:before="0"/>
               <w:ind w:left="120"/>
             </w:pPr>
-            <w:hyperlink w:history="1" r:id="rId1tc99put1_igmsrxrrt2n">
+            <w:hyperlink w:history="1" r:id="rIddzhgdp5h5an4lslx-xtva">
               <w:r>
                 <w:rPr>
                   <w:rFonts w:ascii="Arial" w:cs="Arial" w:eastAsia="Arial" w:hAnsi="Arial"/>
@@ -8559,7 +8726,7 @@
         </w:tc>
         <w:tc>
           <w:tcPr>
-            <w:tcW w:type="dxa" w:w="2556"/>
+            <w:tcW w:type="dxa" w:w="3324"/>
             <w:shd w:fill="FFFFFF" w:color="auto" w:val="clear"/>
             <w:tcMar>
               <w:top w:type="dxa" w:w="60"/>
@@ -8648,7 +8815,7 @@
         </w:tc>
         <w:tc>
           <w:tcPr>
-            <w:tcW w:type="dxa" w:w="2556"/>
+            <w:tcW w:type="dxa" w:w="2300"/>
             <w:shd w:fill="F2F2F2" w:color="auto" w:val="clear"/>
             <w:tcMar>
               <w:top w:type="dxa" w:w="60"/>
@@ -8718,7 +8885,7 @@
         </w:tc>
         <w:tc>
           <w:tcPr>
-            <w:tcW w:type="dxa" w:w="2556"/>
+            <w:tcW w:type="dxa" w:w="2300"/>
             <w:shd w:fill="FFFFFF" w:color="auto" w:val="clear"/>
             <w:tcMar>
               <w:top w:type="dxa" w:w="60"/>
@@ -8803,7 +8970,7 @@
         </w:tc>
         <w:tc>
           <w:tcPr>
-            <w:tcW w:type="dxa" w:w="2556"/>
+            <w:tcW w:type="dxa" w:w="2300"/>
             <w:shd w:fill="FFFFFF" w:color="auto" w:val="clear"/>
             <w:tcMar>
               <w:top w:type="dxa" w:w="60"/>
@@ -8865,7 +9032,7 @@
             <w:pPr>
               <w:spacing w:after="20" w:before="0"/>
             </w:pPr>
-            <w:hyperlink w:history="1" r:id="rIdfvi85z6vorqtyx-uhxjrp">
+            <w:hyperlink w:history="1" r:id="rIddas11uzprj9pyzomfluzl">
               <w:r>
                 <w:rPr>
                   <w:rFonts w:ascii="Arial" w:cs="Arial" w:eastAsia="Arial" w:hAnsi="Arial"/>
@@ -8898,7 +9065,7 @@
               <w:spacing w:after="10" w:before="0"/>
               <w:ind w:left="120"/>
             </w:pPr>
-            <w:hyperlink w:history="1" r:id="rIdjmmvupkkew1wm4zqjr8pd">
+            <w:hyperlink w:history="1" r:id="rIdaufbjxsjzrvxxgko9t99g">
               <w:r>
                 <w:rPr>
                   <w:rFonts w:ascii="Arial" w:cs="Arial" w:eastAsia="Arial" w:hAnsi="Arial"/>
@@ -8943,7 +9110,7 @@
             <w:pPr>
               <w:spacing w:after="20" w:before="0"/>
             </w:pPr>
-            <w:hyperlink w:history="1" r:id="rIdwzdvveaagaitkofcio2-q">
+            <w:hyperlink w:history="1" r:id="rIdr1izaksaqmbyiy2pe7p1j">
               <w:r>
                 <w:rPr>
                   <w:rFonts w:ascii="Arial" w:cs="Arial" w:eastAsia="Arial" w:hAnsi="Arial"/>
@@ -8976,7 +9143,7 @@
               <w:spacing w:after="10" w:before="0"/>
               <w:ind w:left="120"/>
             </w:pPr>
-            <w:hyperlink w:history="1" r:id="rIde5mprxxadvz3j3-ianrvg">
+            <w:hyperlink w:history="1" r:id="rId8bot4zshprufkpfyjyewt">
               <w:r>
                 <w:rPr>
                   <w:rFonts w:ascii="Arial" w:cs="Arial" w:eastAsia="Arial" w:hAnsi="Arial"/>
@@ -8992,7 +9159,7 @@
         </w:tc>
         <w:tc>
           <w:tcPr>
-            <w:tcW w:type="dxa" w:w="2556"/>
+            <w:tcW w:type="dxa" w:w="3324"/>
             <w:shd w:fill="FFFFFF" w:color="auto" w:val="clear"/>
             <w:tcMar>
               <w:top w:type="dxa" w:w="60"/>
@@ -9081,7 +9248,7 @@
         </w:tc>
         <w:tc>
           <w:tcPr>
-            <w:tcW w:type="dxa" w:w="2556"/>
+            <w:tcW w:type="dxa" w:w="2300"/>
             <w:shd w:fill="F2F2F2" w:color="auto" w:val="clear"/>
             <w:tcMar>
               <w:top w:type="dxa" w:w="60"/>
@@ -9132,7 +9299,7 @@
         </w:tc>
         <w:tc>
           <w:tcPr>
-            <w:tcW w:type="dxa" w:w="2556"/>
+            <w:tcW w:type="dxa" w:w="2300"/>
             <w:shd w:fill="FFFFFF" w:color="auto" w:val="clear"/>
             <w:tcMar>
               <w:top w:type="dxa" w:w="60"/>
@@ -9217,7 +9384,7 @@
         </w:tc>
         <w:tc>
           <w:tcPr>
-            <w:tcW w:type="dxa" w:w="2556"/>
+            <w:tcW w:type="dxa" w:w="2300"/>
             <w:shd w:fill="FFFFFF" w:color="auto" w:val="clear"/>
             <w:tcMar>
               <w:top w:type="dxa" w:w="60"/>
@@ -9279,7 +9446,7 @@
             <w:pPr>
               <w:spacing w:after="20" w:before="0"/>
             </w:pPr>
-            <w:hyperlink w:history="1" r:id="rId1nl9fgq3geekakhhrexhr">
+            <w:hyperlink w:history="1" r:id="rIdaup52c6p1ljwz8o9gee4k">
               <w:r>
                 <w:rPr>
                   <w:rFonts w:ascii="Arial" w:cs="Arial" w:eastAsia="Arial" w:hAnsi="Arial"/>
@@ -9312,7 +9479,7 @@
               <w:spacing w:after="10" w:before="0"/>
               <w:ind w:left="120"/>
             </w:pPr>
-            <w:hyperlink w:history="1" r:id="rIduqo9qxtd4ogtqj_85kti7">
+            <w:hyperlink w:history="1" r:id="rIdsqzq8jcp6nucijm7yqwag">
               <w:r>
                 <w:rPr>
                   <w:rFonts w:ascii="Arial" w:cs="Arial" w:eastAsia="Arial" w:hAnsi="Arial"/>
@@ -9357,7 +9524,7 @@
             <w:pPr>
               <w:spacing w:after="20" w:before="0"/>
             </w:pPr>
-            <w:hyperlink w:history="1" r:id="rIdnwlpnudo5fznwnfsfhoij">
+            <w:hyperlink w:history="1" r:id="rIdlvtqebugpsczjks6kfmpd">
               <w:r>
                 <w:rPr>
                   <w:rFonts w:ascii="Arial" w:cs="Arial" w:eastAsia="Arial" w:hAnsi="Arial"/>
@@ -9390,7 +9557,7 @@
               <w:spacing w:after="10" w:before="0"/>
               <w:ind w:left="120"/>
             </w:pPr>
-            <w:hyperlink w:history="1" r:id="rIdpmys7d_6i5asnucltn1mm">
+            <w:hyperlink w:history="1" r:id="rIdavtirn3gzy0ogh6i4o__v">
               <w:r>
                 <w:rPr>
                   <w:rFonts w:ascii="Arial" w:cs="Arial" w:eastAsia="Arial" w:hAnsi="Arial"/>
@@ -9406,7 +9573,7 @@
         </w:tc>
         <w:tc>
           <w:tcPr>
-            <w:tcW w:type="dxa" w:w="2556"/>
+            <w:tcW w:type="dxa" w:w="3324"/>
             <w:shd w:fill="FFFFFF" w:color="auto" w:val="clear"/>
             <w:tcMar>
               <w:top w:type="dxa" w:w="60"/>
@@ -9476,7 +9643,7 @@
         </w:tc>
         <w:tc>
           <w:tcPr>
-            <w:tcW w:type="dxa" w:w="2556"/>
+            <w:tcW w:type="dxa" w:w="2300"/>
             <w:shd w:fill="F2F2F2" w:color="auto" w:val="clear"/>
             <w:tcMar>
               <w:top w:type="dxa" w:w="60"/>
@@ -9527,7 +9694,7 @@
         </w:tc>
         <w:tc>
           <w:tcPr>
-            <w:tcW w:type="dxa" w:w="2556"/>
+            <w:tcW w:type="dxa" w:w="2300"/>
             <w:shd w:fill="FFFFFF" w:color="auto" w:val="clear"/>
             <w:tcMar>
               <w:top w:type="dxa" w:w="60"/>
@@ -11168,11 +11335,11 @@
       </w:tblPr>
       <w:tblGrid>
         <w:gridCol w:w="900"/>
+        <w:gridCol w:w="2300"/>
         <w:gridCol w:w="2556"/>
-        <w:gridCol w:w="2556"/>
-        <w:gridCol w:w="2556"/>
-        <w:gridCol w:w="2556"/>
-        <w:gridCol w:w="2556"/>
+        <w:gridCol w:w="3324"/>
+        <w:gridCol w:w="2300"/>
+        <w:gridCol w:w="2300"/>
       </w:tblGrid>
       <w:tr>
         <w:tc>
@@ -11244,7 +11411,7 @@
         </w:tc>
         <w:tc>
           <w:tcPr>
-            <w:tcW w:type="dxa" w:w="2556"/>
+            <w:tcW w:type="dxa" w:w="2300"/>
             <w:shd w:fill="2E75B6" w:color="auto" w:val="clear"/>
             <w:tcMar>
               <w:top w:type="dxa" w:w="60"/>
@@ -11308,7 +11475,7 @@
         </w:tc>
         <w:tc>
           <w:tcPr>
-            <w:tcW w:type="dxa" w:w="2556"/>
+            <w:tcW w:type="dxa" w:w="3324"/>
             <w:shd w:fill="2E75B6" w:color="auto" w:val="clear"/>
             <w:tcMar>
               <w:top w:type="dxa" w:w="60"/>
@@ -11340,7 +11507,7 @@
         </w:tc>
         <w:tc>
           <w:tcPr>
-            <w:tcW w:type="dxa" w:w="2556"/>
+            <w:tcW w:type="dxa" w:w="2300"/>
             <w:shd w:fill="1F6B75" w:color="auto" w:val="clear"/>
             <w:tcMar>
               <w:top w:type="dxa" w:w="60"/>
@@ -11372,7 +11539,7 @@
         </w:tc>
         <w:tc>
           <w:tcPr>
-            <w:tcW w:type="dxa" w:w="2556"/>
+            <w:tcW w:type="dxa" w:w="2300"/>
             <w:shd w:fill="2E75B6" w:color="auto" w:val="clear"/>
             <w:tcMar>
               <w:top w:type="dxa" w:w="60"/>
@@ -11438,7 +11605,7 @@
         </w:tc>
         <w:tc>
           <w:tcPr>
-            <w:tcW w:type="dxa" w:w="2556"/>
+            <w:tcW w:type="dxa" w:w="2300"/>
             <w:shd w:fill="FFFFFF" w:color="auto" w:val="clear"/>
             <w:tcMar>
               <w:top w:type="dxa" w:w="60"/>
@@ -11500,7 +11667,7 @@
             <w:pPr>
               <w:spacing w:after="20" w:before="0"/>
             </w:pPr>
-            <w:hyperlink w:history="1" r:id="rIdgl4qc4zoepmsnuyds0vy8">
+            <w:hyperlink w:history="1" r:id="rIdvyca1hpcgt1dtpcd6p72z">
               <w:r>
                 <w:rPr>
                   <w:rFonts w:ascii="Arial" w:cs="Arial" w:eastAsia="Arial" w:hAnsi="Arial"/>
@@ -11533,7 +11700,7 @@
               <w:spacing w:after="10" w:before="0"/>
               <w:ind w:left="120"/>
             </w:pPr>
-            <w:hyperlink w:history="1" r:id="rIdsa3hbvnd71jvwkmfzlwon">
+            <w:hyperlink w:history="1" r:id="rIddwfpye-vl2jwlb4gbasoa">
               <w:r>
                 <w:rPr>
                   <w:rFonts w:ascii="Arial" w:cs="Arial" w:eastAsia="Arial" w:hAnsi="Arial"/>
@@ -11578,7 +11745,7 @@
             <w:pPr>
               <w:spacing w:after="20" w:before="0"/>
             </w:pPr>
-            <w:hyperlink w:history="1" r:id="rIdcigqsko9gxprmr7u5df3c">
+            <w:hyperlink w:history="1" r:id="rIdjnvssidjktwabbvb1ee_l">
               <w:r>
                 <w:rPr>
                   <w:rFonts w:ascii="Arial" w:cs="Arial" w:eastAsia="Arial" w:hAnsi="Arial"/>
@@ -11611,7 +11778,7 @@
               <w:spacing w:after="10" w:before="0"/>
               <w:ind w:left="120"/>
             </w:pPr>
-            <w:hyperlink w:history="1" r:id="rIdxjtxiilbkx_nkigqu--et">
+            <w:hyperlink w:history="1" r:id="rIdoxnehen8epmtm8r3lfahc">
               <w:r>
                 <w:rPr>
                   <w:rFonts w:ascii="Arial" w:cs="Arial" w:eastAsia="Arial" w:hAnsi="Arial"/>
@@ -11627,7 +11794,7 @@
         </w:tc>
         <w:tc>
           <w:tcPr>
-            <w:tcW w:type="dxa" w:w="2556"/>
+            <w:tcW w:type="dxa" w:w="3324"/>
             <w:shd w:fill="FFFFFF" w:color="auto" w:val="clear"/>
             <w:tcMar>
               <w:top w:type="dxa" w:w="60"/>
@@ -11697,7 +11864,7 @@
         </w:tc>
         <w:tc>
           <w:tcPr>
-            <w:tcW w:type="dxa" w:w="2556"/>
+            <w:tcW w:type="dxa" w:w="2300"/>
             <w:shd w:fill="F2F2F2" w:color="auto" w:val="clear"/>
             <w:tcMar>
               <w:top w:type="dxa" w:w="60"/>
@@ -11729,7 +11896,7 @@
         </w:tc>
         <w:tc>
           <w:tcPr>
-            <w:tcW w:type="dxa" w:w="2556"/>
+            <w:tcW w:type="dxa" w:w="2300"/>
             <w:shd w:fill="FFFFFF" w:color="auto" w:val="clear"/>
             <w:tcMar>
               <w:top w:type="dxa" w:w="60"/>
@@ -11795,7 +11962,7 @@
         </w:tc>
         <w:tc>
           <w:tcPr>
-            <w:tcW w:type="dxa" w:w="2556"/>
+            <w:tcW w:type="dxa" w:w="2300"/>
             <w:shd w:fill="FFFFFF" w:color="auto" w:val="clear"/>
             <w:tcMar>
               <w:top w:type="dxa" w:w="60"/>
@@ -11952,7 +12119,7 @@
             <w:pPr>
               <w:spacing w:after="20" w:before="0"/>
             </w:pPr>
-            <w:hyperlink w:history="1" r:id="rIdoejqlbxjjumptrz-6g-op">
+            <w:hyperlink w:history="1" r:id="rIdfsifuno9duwy5xjk1tcum">
               <w:r>
                 <w:rPr>
                   <w:rFonts w:ascii="Arial" w:cs="Arial" w:eastAsia="Arial" w:hAnsi="Arial"/>
@@ -11985,7 +12152,7 @@
               <w:spacing w:after="10" w:before="0"/>
               <w:ind w:left="120"/>
             </w:pPr>
-            <w:hyperlink w:history="1" r:id="rIdj5dugllulsn6aqlncwi8i">
+            <w:hyperlink w:history="1" r:id="rIdqkzxtacobslzvlvn1dnz9">
               <w:r>
                 <w:rPr>
                   <w:rFonts w:ascii="Arial" w:cs="Arial" w:eastAsia="Arial" w:hAnsi="Arial"/>
@@ -12030,7 +12197,7 @@
             <w:pPr>
               <w:spacing w:after="20" w:before="0"/>
             </w:pPr>
-            <w:hyperlink w:history="1" r:id="rId-pnjbd_xu9aapmpntga6r">
+            <w:hyperlink w:history="1" r:id="rIdf6fohdhrhhoekmjxjq5ou">
               <w:r>
                 <w:rPr>
                   <w:rFonts w:ascii="Arial" w:cs="Arial" w:eastAsia="Arial" w:hAnsi="Arial"/>
@@ -12063,7 +12230,7 @@
               <w:spacing w:after="10" w:before="0"/>
               <w:ind w:left="120"/>
             </w:pPr>
-            <w:hyperlink w:history="1" r:id="rIdmb4pvukfbmv8oi6kjd0y0">
+            <w:hyperlink w:history="1" r:id="rIddwuqqcmg8c8i7naa2y9ds">
               <w:r>
                 <w:rPr>
                   <w:rFonts w:ascii="Arial" w:cs="Arial" w:eastAsia="Arial" w:hAnsi="Arial"/>
@@ -12079,7 +12246,7 @@
         </w:tc>
         <w:tc>
           <w:tcPr>
-            <w:tcW w:type="dxa" w:w="2556"/>
+            <w:tcW w:type="dxa" w:w="3324"/>
             <w:shd w:fill="FFFFFF" w:color="auto" w:val="clear"/>
             <w:tcMar>
               <w:top w:type="dxa" w:w="60"/>
@@ -12168,7 +12335,7 @@
         </w:tc>
         <w:tc>
           <w:tcPr>
-            <w:tcW w:type="dxa" w:w="2556"/>
+            <w:tcW w:type="dxa" w:w="2300"/>
             <w:shd w:fill="F2F2F2" w:color="auto" w:val="clear"/>
             <w:tcMar>
               <w:top w:type="dxa" w:w="60"/>
@@ -12238,7 +12405,7 @@
         </w:tc>
         <w:tc>
           <w:tcPr>
-            <w:tcW w:type="dxa" w:w="2556"/>
+            <w:tcW w:type="dxa" w:w="2300"/>
             <w:shd w:fill="FFFFFF" w:color="auto" w:val="clear"/>
             <w:tcMar>
               <w:top w:type="dxa" w:w="60"/>
@@ -12342,7 +12509,7 @@
         </w:tc>
         <w:tc>
           <w:tcPr>
-            <w:tcW w:type="dxa" w:w="2556"/>
+            <w:tcW w:type="dxa" w:w="2300"/>
             <w:shd w:fill="FFFFFF" w:color="auto" w:val="clear"/>
             <w:tcMar>
               <w:top w:type="dxa" w:w="60"/>
@@ -12404,7 +12571,7 @@
             <w:pPr>
               <w:spacing w:after="20" w:before="0"/>
             </w:pPr>
-            <w:hyperlink w:history="1" r:id="rId8kxdrpf_b3bnba6xo4827">
+            <w:hyperlink w:history="1" r:id="rIdbwdvenpcvxfpyvroqnp_z">
               <w:r>
                 <w:rPr>
                   <w:rFonts w:ascii="Arial" w:cs="Arial" w:eastAsia="Arial" w:hAnsi="Arial"/>
@@ -12437,7 +12604,7 @@
               <w:spacing w:after="10" w:before="0"/>
               <w:ind w:left="120"/>
             </w:pPr>
-            <w:hyperlink w:history="1" r:id="rId2bygsoegzjd8yueqprocu">
+            <w:hyperlink w:history="1" r:id="rIdwv0vgz8ieadcmwvpvluap">
               <w:r>
                 <w:rPr>
                   <w:rFonts w:ascii="Arial" w:cs="Arial" w:eastAsia="Arial" w:hAnsi="Arial"/>
@@ -12482,7 +12649,7 @@
             <w:pPr>
               <w:spacing w:after="20" w:before="0"/>
             </w:pPr>
-            <w:hyperlink w:history="1" r:id="rId7lrlprkm5lopqttmos3rk">
+            <w:hyperlink w:history="1" r:id="rId4_vpo6mcv72izqojbh_hh">
               <w:r>
                 <w:rPr>
                   <w:rFonts w:ascii="Arial" w:cs="Arial" w:eastAsia="Arial" w:hAnsi="Arial"/>
@@ -12515,7 +12682,7 @@
               <w:spacing w:after="10" w:before="0"/>
               <w:ind w:left="120"/>
             </w:pPr>
-            <w:hyperlink w:history="1" r:id="rIdjobefp4peqnfmddyax7ds">
+            <w:hyperlink w:history="1" r:id="rIdgrb0ef2vx9dlp8jeqcnew">
               <w:r>
                 <w:rPr>
                   <w:rFonts w:ascii="Arial" w:cs="Arial" w:eastAsia="Arial" w:hAnsi="Arial"/>
@@ -12531,7 +12698,7 @@
         </w:tc>
         <w:tc>
           <w:tcPr>
-            <w:tcW w:type="dxa" w:w="2556"/>
+            <w:tcW w:type="dxa" w:w="3324"/>
             <w:shd w:fill="FFFFFF" w:color="auto" w:val="clear"/>
             <w:tcMar>
               <w:top w:type="dxa" w:w="60"/>
@@ -12620,7 +12787,7 @@
         </w:tc>
         <w:tc>
           <w:tcPr>
-            <w:tcW w:type="dxa" w:w="2556"/>
+            <w:tcW w:type="dxa" w:w="2300"/>
             <w:shd w:fill="F2F2F2" w:color="auto" w:val="clear"/>
             <w:tcMar>
               <w:top w:type="dxa" w:w="60"/>
@@ -12690,7 +12857,7 @@
         </w:tc>
         <w:tc>
           <w:tcPr>
-            <w:tcW w:type="dxa" w:w="2556"/>
+            <w:tcW w:type="dxa" w:w="2300"/>
             <w:shd w:fill="FFFFFF" w:color="auto" w:val="clear"/>
             <w:tcMar>
               <w:top w:type="dxa" w:w="60"/>
@@ -12775,7 +12942,7 @@
         </w:tc>
         <w:tc>
           <w:tcPr>
-            <w:tcW w:type="dxa" w:w="2556"/>
+            <w:tcW w:type="dxa" w:w="2300"/>
             <w:shd w:fill="FFFFFF" w:color="auto" w:val="clear"/>
             <w:tcMar>
               <w:top w:type="dxa" w:w="60"/>
@@ -12837,7 +13004,7 @@
             <w:pPr>
               <w:spacing w:after="20" w:before="0"/>
             </w:pPr>
-            <w:hyperlink w:history="1" r:id="rIdylyuun3oezcllp2lbfpce">
+            <w:hyperlink w:history="1" r:id="rIdwwo4nlbwhq5xhqjgjfmzy">
               <w:r>
                 <w:rPr>
                   <w:rFonts w:ascii="Arial" w:cs="Arial" w:eastAsia="Arial" w:hAnsi="Arial"/>
@@ -12870,7 +13037,7 @@
               <w:spacing w:after="10" w:before="0"/>
               <w:ind w:left="120"/>
             </w:pPr>
-            <w:hyperlink w:history="1" r:id="rIdcctodvds3wq24g7_qso38">
+            <w:hyperlink w:history="1" r:id="rIdxscsz7nn_a-y7lbzhkjek">
               <w:r>
                 <w:rPr>
                   <w:rFonts w:ascii="Arial" w:cs="Arial" w:eastAsia="Arial" w:hAnsi="Arial"/>
@@ -12915,7 +13082,7 @@
             <w:pPr>
               <w:spacing w:after="20" w:before="0"/>
             </w:pPr>
-            <w:hyperlink w:history="1" r:id="rId9aywqs2yqtetw4te0tw7u">
+            <w:hyperlink w:history="1" r:id="rIda0erpnl3wzpuw4wa1wl_q">
               <w:r>
                 <w:rPr>
                   <w:rFonts w:ascii="Arial" w:cs="Arial" w:eastAsia="Arial" w:hAnsi="Arial"/>
@@ -12948,7 +13115,7 @@
               <w:spacing w:after="10" w:before="0"/>
               <w:ind w:left="120"/>
             </w:pPr>
-            <w:hyperlink w:history="1" r:id="rIdvyqnvxaqhcg4bkpmwyhti">
+            <w:hyperlink w:history="1" r:id="rIdqshcby4v5fj2-tfup6slm">
               <w:r>
                 <w:rPr>
                   <w:rFonts w:ascii="Arial" w:cs="Arial" w:eastAsia="Arial" w:hAnsi="Arial"/>
@@ -12964,7 +13131,7 @@
         </w:tc>
         <w:tc>
           <w:tcPr>
-            <w:tcW w:type="dxa" w:w="2556"/>
+            <w:tcW w:type="dxa" w:w="3324"/>
             <w:shd w:fill="FFFFFF" w:color="auto" w:val="clear"/>
             <w:tcMar>
               <w:top w:type="dxa" w:w="60"/>
@@ -13053,7 +13220,7 @@
         </w:tc>
         <w:tc>
           <w:tcPr>
-            <w:tcW w:type="dxa" w:w="2556"/>
+            <w:tcW w:type="dxa" w:w="2300"/>
             <w:shd w:fill="F2F2F2" w:color="auto" w:val="clear"/>
             <w:tcMar>
               <w:top w:type="dxa" w:w="60"/>
@@ -13104,7 +13271,7 @@
         </w:tc>
         <w:tc>
           <w:tcPr>
-            <w:tcW w:type="dxa" w:w="2556"/>
+            <w:tcW w:type="dxa" w:w="2300"/>
             <w:shd w:fill="FFFFFF" w:color="auto" w:val="clear"/>
             <w:tcMar>
               <w:top w:type="dxa" w:w="60"/>
@@ -13170,7 +13337,7 @@
         </w:tc>
         <w:tc>
           <w:tcPr>
-            <w:tcW w:type="dxa" w:w="2556"/>
+            <w:tcW w:type="dxa" w:w="2300"/>
             <w:shd w:fill="FFFFFF" w:color="auto" w:val="clear"/>
             <w:tcMar>
               <w:top w:type="dxa" w:w="60"/>
@@ -13232,7 +13399,7 @@
             <w:pPr>
               <w:spacing w:after="20" w:before="0"/>
             </w:pPr>
-            <w:hyperlink w:history="1" r:id="rIducvu9mwrdwdstm4skq_hb">
+            <w:hyperlink w:history="1" r:id="rIdz9o9gg72s-eekksas9kkh">
               <w:r>
                 <w:rPr>
                   <w:rFonts w:ascii="Arial" w:cs="Arial" w:eastAsia="Arial" w:hAnsi="Arial"/>
@@ -13265,7 +13432,7 @@
               <w:spacing w:after="10" w:before="0"/>
               <w:ind w:left="120"/>
             </w:pPr>
-            <w:hyperlink w:history="1" r:id="rIdnxssjhcwa3egjsuf9xf7a">
+            <w:hyperlink w:history="1" r:id="rIdrzrhncxgi1sm5deoa0kxw">
               <w:r>
                 <w:rPr>
                   <w:rFonts w:ascii="Arial" w:cs="Arial" w:eastAsia="Arial" w:hAnsi="Arial"/>
@@ -13310,7 +13477,7 @@
             <w:pPr>
               <w:spacing w:after="20" w:before="0"/>
             </w:pPr>
-            <w:hyperlink w:history="1" r:id="rIdbjmquz-f56u-zdxu9gep7">
+            <w:hyperlink w:history="1" r:id="rIdqiqeddv8q0pu-v3ezorva">
               <w:r>
                 <w:rPr>
                   <w:rFonts w:ascii="Arial" w:cs="Arial" w:eastAsia="Arial" w:hAnsi="Arial"/>
@@ -13343,7 +13510,7 @@
               <w:spacing w:after="10" w:before="0"/>
               <w:ind w:left="120"/>
             </w:pPr>
-            <w:hyperlink w:history="1" r:id="rIdofvljgud_ustvxliwfbzd">
+            <w:hyperlink w:history="1" r:id="rIdj5gvgmugrxdrdrlgylme0">
               <w:r>
                 <w:rPr>
                   <w:rFonts w:ascii="Arial" w:cs="Arial" w:eastAsia="Arial" w:hAnsi="Arial"/>
@@ -13359,7 +13526,7 @@
         </w:tc>
         <w:tc>
           <w:tcPr>
-            <w:tcW w:type="dxa" w:w="2556"/>
+            <w:tcW w:type="dxa" w:w="3324"/>
             <w:shd w:fill="FFFFFF" w:color="auto" w:val="clear"/>
             <w:tcMar>
               <w:top w:type="dxa" w:w="60"/>
@@ -13429,7 +13596,7 @@
         </w:tc>
         <w:tc>
           <w:tcPr>
-            <w:tcW w:type="dxa" w:w="2556"/>
+            <w:tcW w:type="dxa" w:w="2300"/>
             <w:shd w:fill="F2F2F2" w:color="auto" w:val="clear"/>
             <w:tcMar>
               <w:top w:type="dxa" w:w="60"/>
@@ -13480,7 +13647,7 @@
         </w:tc>
         <w:tc>
           <w:tcPr>
-            <w:tcW w:type="dxa" w:w="2556"/>
+            <w:tcW w:type="dxa" w:w="2300"/>
             <w:shd w:fill="FFFFFF" w:color="auto" w:val="clear"/>
             <w:tcMar>
               <w:top w:type="dxa" w:w="60"/>
@@ -15001,11 +15168,11 @@
       </w:tblPr>
       <w:tblGrid>
         <w:gridCol w:w="900"/>
+        <w:gridCol w:w="2300"/>
         <w:gridCol w:w="2556"/>
-        <w:gridCol w:w="2556"/>
-        <w:gridCol w:w="2556"/>
-        <w:gridCol w:w="2556"/>
-        <w:gridCol w:w="2556"/>
+        <w:gridCol w:w="3324"/>
+        <w:gridCol w:w="2300"/>
+        <w:gridCol w:w="2300"/>
       </w:tblGrid>
       <w:tr>
         <w:tc>
@@ -15077,7 +15244,7 @@
         </w:tc>
         <w:tc>
           <w:tcPr>
-            <w:tcW w:type="dxa" w:w="2556"/>
+            <w:tcW w:type="dxa" w:w="2300"/>
             <w:shd w:fill="2E75B6" w:color="auto" w:val="clear"/>
             <w:tcMar>
               <w:top w:type="dxa" w:w="60"/>
@@ -15141,7 +15308,7 @@
         </w:tc>
         <w:tc>
           <w:tcPr>
-            <w:tcW w:type="dxa" w:w="2556"/>
+            <w:tcW w:type="dxa" w:w="3324"/>
             <w:shd w:fill="2E75B6" w:color="auto" w:val="clear"/>
             <w:tcMar>
               <w:top w:type="dxa" w:w="60"/>
@@ -15173,7 +15340,7 @@
         </w:tc>
         <w:tc>
           <w:tcPr>
-            <w:tcW w:type="dxa" w:w="2556"/>
+            <w:tcW w:type="dxa" w:w="2300"/>
             <w:shd w:fill="1F6B75" w:color="auto" w:val="clear"/>
             <w:tcMar>
               <w:top w:type="dxa" w:w="60"/>
@@ -15205,7 +15372,7 @@
         </w:tc>
         <w:tc>
           <w:tcPr>
-            <w:tcW w:type="dxa" w:w="2556"/>
+            <w:tcW w:type="dxa" w:w="2300"/>
             <w:shd w:fill="2E75B6" w:color="auto" w:val="clear"/>
             <w:tcMar>
               <w:top w:type="dxa" w:w="60"/>
@@ -15271,7 +15438,7 @@
         </w:tc>
         <w:tc>
           <w:tcPr>
-            <w:tcW w:type="dxa" w:w="2556"/>
+            <w:tcW w:type="dxa" w:w="2300"/>
             <w:shd w:fill="FFFFFF" w:color="auto" w:val="clear"/>
             <w:tcMar>
               <w:top w:type="dxa" w:w="60"/>
@@ -15333,7 +15500,7 @@
             <w:pPr>
               <w:spacing w:after="20" w:before="0"/>
             </w:pPr>
-            <w:hyperlink w:history="1" r:id="rIdjtd_zrb0xlbhx5t9wdajy">
+            <w:hyperlink w:history="1" r:id="rIdm7nfdj4lulj7-79eu8shk">
               <w:r>
                 <w:rPr>
                   <w:rFonts w:ascii="Arial" w:cs="Arial" w:eastAsia="Arial" w:hAnsi="Arial"/>
@@ -15366,7 +15533,7 @@
               <w:spacing w:after="10" w:before="0"/>
               <w:ind w:left="120"/>
             </w:pPr>
-            <w:hyperlink w:history="1" r:id="rIdcdl4kiqg3hadacmo5i3ql">
+            <w:hyperlink w:history="1" r:id="rIdfpxatilni5ywjqb0hxnfc">
               <w:r>
                 <w:rPr>
                   <w:rFonts w:ascii="Arial" w:cs="Arial" w:eastAsia="Arial" w:hAnsi="Arial"/>
@@ -15411,7 +15578,7 @@
             <w:pPr>
               <w:spacing w:after="20" w:before="0"/>
             </w:pPr>
-            <w:hyperlink w:history="1" r:id="rIdb0fs-nxzkfzqs7eeub28n">
+            <w:hyperlink w:history="1" r:id="rIdyshbu8a-xpy1g1_qm3er7">
               <w:r>
                 <w:rPr>
                   <w:rFonts w:ascii="Arial" w:cs="Arial" w:eastAsia="Arial" w:hAnsi="Arial"/>
@@ -15444,7 +15611,7 @@
               <w:spacing w:after="10" w:before="0"/>
               <w:ind w:left="120"/>
             </w:pPr>
-            <w:hyperlink w:history="1" r:id="rId-oktvislhcyjyjp62vsco">
+            <w:hyperlink w:history="1" r:id="rIdqn1x7scqam_petpszukzt">
               <w:r>
                 <w:rPr>
                   <w:rFonts w:ascii="Arial" w:cs="Arial" w:eastAsia="Arial" w:hAnsi="Arial"/>
@@ -15460,7 +15627,7 @@
         </w:tc>
         <w:tc>
           <w:tcPr>
-            <w:tcW w:type="dxa" w:w="2556"/>
+            <w:tcW w:type="dxa" w:w="3324"/>
             <w:shd w:fill="FFFFFF" w:color="auto" w:val="clear"/>
             <w:tcMar>
               <w:top w:type="dxa" w:w="60"/>
@@ -15511,7 +15678,7 @@
         </w:tc>
         <w:tc>
           <w:tcPr>
-            <w:tcW w:type="dxa" w:w="2556"/>
+            <w:tcW w:type="dxa" w:w="2300"/>
             <w:shd w:fill="F2F2F2" w:color="auto" w:val="clear"/>
             <w:tcMar>
               <w:top w:type="dxa" w:w="60"/>
@@ -15543,7 +15710,7 @@
         </w:tc>
         <w:tc>
           <w:tcPr>
-            <w:tcW w:type="dxa" w:w="2556"/>
+            <w:tcW w:type="dxa" w:w="2300"/>
             <w:shd w:fill="FFFFFF" w:color="auto" w:val="clear"/>
             <w:tcMar>
               <w:top w:type="dxa" w:w="60"/>
@@ -15609,7 +15776,7 @@
         </w:tc>
         <w:tc>
           <w:tcPr>
-            <w:tcW w:type="dxa" w:w="2556"/>
+            <w:tcW w:type="dxa" w:w="2300"/>
             <w:shd w:fill="FFFFFF" w:color="auto" w:val="clear"/>
             <w:tcMar>
               <w:top w:type="dxa" w:w="60"/>
@@ -15728,7 +15895,7 @@
             <w:pPr>
               <w:spacing w:after="20" w:before="0"/>
             </w:pPr>
-            <w:hyperlink w:history="1" r:id="rId2edt_hk4dksrq0oujvpml">
+            <w:hyperlink w:history="1" r:id="rId5ie8wynfths9qdpykwqxu">
               <w:r>
                 <w:rPr>
                   <w:rFonts w:ascii="Arial" w:cs="Arial" w:eastAsia="Arial" w:hAnsi="Arial"/>
@@ -15761,7 +15928,7 @@
               <w:spacing w:after="10" w:before="0"/>
               <w:ind w:left="120"/>
             </w:pPr>
-            <w:hyperlink w:history="1" r:id="rIdubt3nsjsuk4pgmxjh6let">
+            <w:hyperlink w:history="1" r:id="rIdmrktwtsxbnwfp4rsde8jo">
               <w:r>
                 <w:rPr>
                   <w:rFonts w:ascii="Arial" w:cs="Arial" w:eastAsia="Arial" w:hAnsi="Arial"/>
@@ -15806,7 +15973,7 @@
             <w:pPr>
               <w:spacing w:after="20" w:before="0"/>
             </w:pPr>
-            <w:hyperlink w:history="1" r:id="rIdphqbebz575ncarzswrswv">
+            <w:hyperlink w:history="1" r:id="rIdl8nxlurtfsxaavv7izrqc">
               <w:r>
                 <w:rPr>
                   <w:rFonts w:ascii="Arial" w:cs="Arial" w:eastAsia="Arial" w:hAnsi="Arial"/>
@@ -15839,7 +16006,7 @@
               <w:spacing w:after="10" w:before="0"/>
               <w:ind w:left="120"/>
             </w:pPr>
-            <w:hyperlink w:history="1" r:id="rIdiygf4yugt0r24vbsgoevn">
+            <w:hyperlink w:history="1" r:id="rIdr94n2kkqweo1omdqldtju">
               <w:r>
                 <w:rPr>
                   <w:rFonts w:ascii="Arial" w:cs="Arial" w:eastAsia="Arial" w:hAnsi="Arial"/>
@@ -15855,7 +16022,7 @@
         </w:tc>
         <w:tc>
           <w:tcPr>
-            <w:tcW w:type="dxa" w:w="2556"/>
+            <w:tcW w:type="dxa" w:w="3324"/>
             <w:shd w:fill="FFFFFF" w:color="auto" w:val="clear"/>
             <w:tcMar>
               <w:top w:type="dxa" w:w="60"/>
@@ -15944,7 +16111,7 @@
         </w:tc>
         <w:tc>
           <w:tcPr>
-            <w:tcW w:type="dxa" w:w="2556"/>
+            <w:tcW w:type="dxa" w:w="2300"/>
             <w:shd w:fill="F2F2F2" w:color="auto" w:val="clear"/>
             <w:tcMar>
               <w:top w:type="dxa" w:w="60"/>
@@ -15995,7 +16162,7 @@
         </w:tc>
         <w:tc>
           <w:tcPr>
-            <w:tcW w:type="dxa" w:w="2556"/>
+            <w:tcW w:type="dxa" w:w="2300"/>
             <w:shd w:fill="FFFFFF" w:color="auto" w:val="clear"/>
             <w:tcMar>
               <w:top w:type="dxa" w:w="60"/>
@@ -16099,7 +16266,7 @@
         </w:tc>
         <w:tc>
           <w:tcPr>
-            <w:tcW w:type="dxa" w:w="2556"/>
+            <w:tcW w:type="dxa" w:w="2300"/>
             <w:shd w:fill="FFFFFF" w:color="auto" w:val="clear"/>
             <w:tcMar>
               <w:top w:type="dxa" w:w="60"/>
@@ -16161,7 +16328,7 @@
             <w:pPr>
               <w:spacing w:after="20" w:before="0"/>
             </w:pPr>
-            <w:hyperlink w:history="1" r:id="rIdjbqauhp7honieyuezyuaz">
+            <w:hyperlink w:history="1" r:id="rIdrwd06xofakkmw-ksulyt_">
               <w:r>
                 <w:rPr>
                   <w:rFonts w:ascii="Arial" w:cs="Arial" w:eastAsia="Arial" w:hAnsi="Arial"/>
@@ -16194,7 +16361,7 @@
               <w:spacing w:after="10" w:before="0"/>
               <w:ind w:left="120"/>
             </w:pPr>
-            <w:hyperlink w:history="1" r:id="rIdnlc9xz6mhhn5-wlz0r81k">
+            <w:hyperlink w:history="1" r:id="rId_mosoivwt8g_-xgbvs0wo">
               <w:r>
                 <w:rPr>
                   <w:rFonts w:ascii="Arial" w:cs="Arial" w:eastAsia="Arial" w:hAnsi="Arial"/>
@@ -16239,7 +16406,7 @@
             <w:pPr>
               <w:spacing w:after="20" w:before="0"/>
             </w:pPr>
-            <w:hyperlink w:history="1" r:id="rIdsvmdf4vqjyn4yzm5ykmpb">
+            <w:hyperlink w:history="1" r:id="rIdafiswbzjsod5_zv4inuak">
               <w:r>
                 <w:rPr>
                   <w:rFonts w:ascii="Arial" w:cs="Arial" w:eastAsia="Arial" w:hAnsi="Arial"/>
@@ -16272,7 +16439,7 @@
               <w:spacing w:after="10" w:before="0"/>
               <w:ind w:left="120"/>
             </w:pPr>
-            <w:hyperlink w:history="1" r:id="rIdidffp8dn3xhxdcbnbsmzx">
+            <w:hyperlink w:history="1" r:id="rIdmqrchewchzbnlplsebzm3">
               <w:r>
                 <w:rPr>
                   <w:rFonts w:ascii="Arial" w:cs="Arial" w:eastAsia="Arial" w:hAnsi="Arial"/>
@@ -16288,7 +16455,7 @@
         </w:tc>
         <w:tc>
           <w:tcPr>
-            <w:tcW w:type="dxa" w:w="2556"/>
+            <w:tcW w:type="dxa" w:w="3324"/>
             <w:shd w:fill="FFFFFF" w:color="auto" w:val="clear"/>
             <w:tcMar>
               <w:top w:type="dxa" w:w="60"/>
@@ -16377,7 +16544,7 @@
         </w:tc>
         <w:tc>
           <w:tcPr>
-            <w:tcW w:type="dxa" w:w="2556"/>
+            <w:tcW w:type="dxa" w:w="2300"/>
             <w:shd w:fill="F2F2F2" w:color="auto" w:val="clear"/>
             <w:tcMar>
               <w:top w:type="dxa" w:w="60"/>
@@ -16447,7 +16614,7 @@
         </w:tc>
         <w:tc>
           <w:tcPr>
-            <w:tcW w:type="dxa" w:w="2556"/>
+            <w:tcW w:type="dxa" w:w="2300"/>
             <w:shd w:fill="FFFFFF" w:color="auto" w:val="clear"/>
             <w:tcMar>
               <w:top w:type="dxa" w:w="60"/>
@@ -16532,7 +16699,7 @@
         </w:tc>
         <w:tc>
           <w:tcPr>
-            <w:tcW w:type="dxa" w:w="2556"/>
+            <w:tcW w:type="dxa" w:w="2300"/>
             <w:shd w:fill="FFFFFF" w:color="auto" w:val="clear"/>
             <w:tcMar>
               <w:top w:type="dxa" w:w="60"/>
@@ -16594,7 +16761,7 @@
             <w:pPr>
               <w:spacing w:after="20" w:before="0"/>
             </w:pPr>
-            <w:hyperlink w:history="1" r:id="rIdbzeuxdeuzwdgmubpjw738">
+            <w:hyperlink w:history="1" r:id="rIdb6xz03m3ews8z79_9m-uz">
               <w:r>
                 <w:rPr>
                   <w:rFonts w:ascii="Arial" w:cs="Arial" w:eastAsia="Arial" w:hAnsi="Arial"/>
@@ -16627,7 +16794,7 @@
               <w:spacing w:after="10" w:before="0"/>
               <w:ind w:left="120"/>
             </w:pPr>
-            <w:hyperlink w:history="1" r:id="rIdzlzn8pjaiy9w24hnwempt">
+            <w:hyperlink w:history="1" r:id="rIdnb0tibyon5qvdkvamreue">
               <w:r>
                 <w:rPr>
                   <w:rFonts w:ascii="Arial" w:cs="Arial" w:eastAsia="Arial" w:hAnsi="Arial"/>
@@ -16672,7 +16839,7 @@
             <w:pPr>
               <w:spacing w:after="20" w:before="0"/>
             </w:pPr>
-            <w:hyperlink w:history="1" r:id="rIdmqjkqqyi3jvvuoziitjkc">
+            <w:hyperlink w:history="1" r:id="rId9k9w0drvoon49qtpk8q_c">
               <w:r>
                 <w:rPr>
                   <w:rFonts w:ascii="Arial" w:cs="Arial" w:eastAsia="Arial" w:hAnsi="Arial"/>
@@ -16705,7 +16872,7 @@
               <w:spacing w:after="10" w:before="0"/>
               <w:ind w:left="120"/>
             </w:pPr>
-            <w:hyperlink w:history="1" r:id="rIdt_k2n2zg7hwu5smkjpasx">
+            <w:hyperlink w:history="1" r:id="rIdziupm8uhnknpsjngsucd2">
               <w:r>
                 <w:rPr>
                   <w:rFonts w:ascii="Arial" w:cs="Arial" w:eastAsia="Arial" w:hAnsi="Arial"/>
@@ -16721,7 +16888,7 @@
         </w:tc>
         <w:tc>
           <w:tcPr>
-            <w:tcW w:type="dxa" w:w="2556"/>
+            <w:tcW w:type="dxa" w:w="3324"/>
             <w:shd w:fill="FFFFFF" w:color="auto" w:val="clear"/>
             <w:tcMar>
               <w:top w:type="dxa" w:w="60"/>
@@ -16791,7 +16958,7 @@
         </w:tc>
         <w:tc>
           <w:tcPr>
-            <w:tcW w:type="dxa" w:w="2556"/>
+            <w:tcW w:type="dxa" w:w="2300"/>
             <w:shd w:fill="F2F2F2" w:color="auto" w:val="clear"/>
             <w:tcMar>
               <w:top w:type="dxa" w:w="60"/>
@@ -16823,7 +16990,7 @@
         </w:tc>
         <w:tc>
           <w:tcPr>
-            <w:tcW w:type="dxa" w:w="2556"/>
+            <w:tcW w:type="dxa" w:w="2300"/>
             <w:shd w:fill="FFFFFF" w:color="auto" w:val="clear"/>
             <w:tcMar>
               <w:top w:type="dxa" w:w="60"/>
@@ -16889,7 +17056,7 @@
         </w:tc>
         <w:tc>
           <w:tcPr>
-            <w:tcW w:type="dxa" w:w="2556"/>
+            <w:tcW w:type="dxa" w:w="2300"/>
             <w:shd w:fill="FFFFFF" w:color="auto" w:val="clear"/>
             <w:tcMar>
               <w:top w:type="dxa" w:w="60"/>
@@ -16951,7 +17118,7 @@
             <w:pPr>
               <w:spacing w:after="20" w:before="0"/>
             </w:pPr>
-            <w:hyperlink w:history="1" r:id="rId4uryfjgpcnt047wsiydky">
+            <w:hyperlink w:history="1" r:id="rId1mvbkondn48h2lxqkfctr">
               <w:r>
                 <w:rPr>
                   <w:rFonts w:ascii="Arial" w:cs="Arial" w:eastAsia="Arial" w:hAnsi="Arial"/>
@@ -16984,7 +17151,7 @@
               <w:spacing w:after="10" w:before="0"/>
               <w:ind w:left="120"/>
             </w:pPr>
-            <w:hyperlink w:history="1" r:id="rIdcu95jxwaexylyguy25bd6">
+            <w:hyperlink w:history="1" r:id="rIdxmburytz6o5kjfoi6axar">
               <w:r>
                 <w:rPr>
                   <w:rFonts w:ascii="Arial" w:cs="Arial" w:eastAsia="Arial" w:hAnsi="Arial"/>
@@ -17029,7 +17196,7 @@
             <w:pPr>
               <w:spacing w:after="20" w:before="0"/>
             </w:pPr>
-            <w:hyperlink w:history="1" r:id="rIdmi_7unfbrokuix2ge-93v">
+            <w:hyperlink w:history="1" r:id="rIdzc9atgd936pwbaij66j-e">
               <w:r>
                 <w:rPr>
                   <w:rFonts w:ascii="Arial" w:cs="Arial" w:eastAsia="Arial" w:hAnsi="Arial"/>
@@ -17062,7 +17229,7 @@
               <w:spacing w:after="10" w:before="0"/>
               <w:ind w:left="120"/>
             </w:pPr>
-            <w:hyperlink w:history="1" r:id="rIdsytrmd42klnjtpwleprid">
+            <w:hyperlink w:history="1" r:id="rIdiqoygijx5kje1eppht2bl">
               <w:r>
                 <w:rPr>
                   <w:rFonts w:ascii="Arial" w:cs="Arial" w:eastAsia="Arial" w:hAnsi="Arial"/>
@@ -17078,7 +17245,7 @@
         </w:tc>
         <w:tc>
           <w:tcPr>
-            <w:tcW w:type="dxa" w:w="2556"/>
+            <w:tcW w:type="dxa" w:w="3324"/>
             <w:shd w:fill="FFFFFF" w:color="auto" w:val="clear"/>
             <w:tcMar>
               <w:top w:type="dxa" w:w="60"/>
@@ -17148,7 +17315,7 @@
         </w:tc>
         <w:tc>
           <w:tcPr>
-            <w:tcW w:type="dxa" w:w="2556"/>
+            <w:tcW w:type="dxa" w:w="2300"/>
             <w:shd w:fill="F2F2F2" w:color="auto" w:val="clear"/>
             <w:tcMar>
               <w:top w:type="dxa" w:w="60"/>
@@ -17199,7 +17366,7 @@
         </w:tc>
         <w:tc>
           <w:tcPr>
-            <w:tcW w:type="dxa" w:w="2556"/>
+            <w:tcW w:type="dxa" w:w="2300"/>
             <w:shd w:fill="FFFFFF" w:color="auto" w:val="clear"/>
             <w:tcMar>
               <w:top w:type="dxa" w:w="60"/>
@@ -18739,11 +18906,11 @@
       </w:tblPr>
       <w:tblGrid>
         <w:gridCol w:w="900"/>
+        <w:gridCol w:w="2300"/>
         <w:gridCol w:w="2556"/>
-        <w:gridCol w:w="2556"/>
-        <w:gridCol w:w="2556"/>
-        <w:gridCol w:w="2556"/>
-        <w:gridCol w:w="2556"/>
+        <w:gridCol w:w="3324"/>
+        <w:gridCol w:w="2300"/>
+        <w:gridCol w:w="2300"/>
       </w:tblGrid>
       <w:tr>
         <w:tc>
@@ -18815,7 +18982,7 @@
         </w:tc>
         <w:tc>
           <w:tcPr>
-            <w:tcW w:type="dxa" w:w="2556"/>
+            <w:tcW w:type="dxa" w:w="2300"/>
             <w:shd w:fill="2E75B6" w:color="auto" w:val="clear"/>
             <w:tcMar>
               <w:top w:type="dxa" w:w="60"/>
@@ -18879,7 +19046,7 @@
         </w:tc>
         <w:tc>
           <w:tcPr>
-            <w:tcW w:type="dxa" w:w="2556"/>
+            <w:tcW w:type="dxa" w:w="3324"/>
             <w:shd w:fill="2E75B6" w:color="auto" w:val="clear"/>
             <w:tcMar>
               <w:top w:type="dxa" w:w="60"/>
@@ -18911,7 +19078,7 @@
         </w:tc>
         <w:tc>
           <w:tcPr>
-            <w:tcW w:type="dxa" w:w="2556"/>
+            <w:tcW w:type="dxa" w:w="2300"/>
             <w:shd w:fill="1F6B75" w:color="auto" w:val="clear"/>
             <w:tcMar>
               <w:top w:type="dxa" w:w="60"/>
@@ -18943,7 +19110,7 @@
         </w:tc>
         <w:tc>
           <w:tcPr>
-            <w:tcW w:type="dxa" w:w="2556"/>
+            <w:tcW w:type="dxa" w:w="2300"/>
             <w:shd w:fill="2E75B6" w:color="auto" w:val="clear"/>
             <w:tcMar>
               <w:top w:type="dxa" w:w="60"/>
@@ -19009,7 +19176,7 @@
         </w:tc>
         <w:tc>
           <w:tcPr>
-            <w:tcW w:type="dxa" w:w="2556"/>
+            <w:tcW w:type="dxa" w:w="2300"/>
             <w:shd w:fill="FFFFFF" w:color="auto" w:val="clear"/>
             <w:tcMar>
               <w:top w:type="dxa" w:w="60"/>
@@ -19071,7 +19238,7 @@
             <w:pPr>
               <w:spacing w:after="20" w:before="0"/>
             </w:pPr>
-            <w:hyperlink w:history="1" r:id="rIdyk-knufarqkllk3uzgnwo">
+            <w:hyperlink w:history="1" r:id="rIdtxemzvederw9rgqwwhjk9">
               <w:r>
                 <w:rPr>
                   <w:rFonts w:ascii="Arial" w:cs="Arial" w:eastAsia="Arial" w:hAnsi="Arial"/>
@@ -19104,7 +19271,7 @@
               <w:spacing w:after="10" w:before="0"/>
               <w:ind w:left="120"/>
             </w:pPr>
-            <w:hyperlink w:history="1" r:id="rId742ahtrnrttb_bznvozzr">
+            <w:hyperlink w:history="1" r:id="rIdwpqcxfjnv4lfresjkv-ky">
               <w:r>
                 <w:rPr>
                   <w:rFonts w:ascii="Arial" w:cs="Arial" w:eastAsia="Arial" w:hAnsi="Arial"/>
@@ -19149,7 +19316,7 @@
             <w:pPr>
               <w:spacing w:after="20" w:before="0"/>
             </w:pPr>
-            <w:hyperlink w:history="1" r:id="rIdeu6_tzanehsjnuk8vmixh">
+            <w:hyperlink w:history="1" r:id="rIditdoefmz30hd_pxbsq6ng">
               <w:r>
                 <w:rPr>
                   <w:rFonts w:ascii="Arial" w:cs="Arial" w:eastAsia="Arial" w:hAnsi="Arial"/>
@@ -19182,7 +19349,7 @@
               <w:spacing w:after="10" w:before="0"/>
               <w:ind w:left="120"/>
             </w:pPr>
-            <w:hyperlink w:history="1" r:id="rIdvt9gf3aq6v5ek1jrswias">
+            <w:hyperlink w:history="1" r:id="rIdst56vquc3ah_bmm8rvv6t">
               <w:r>
                 <w:rPr>
                   <w:rFonts w:ascii="Arial" w:cs="Arial" w:eastAsia="Arial" w:hAnsi="Arial"/>
@@ -19198,7 +19365,7 @@
         </w:tc>
         <w:tc>
           <w:tcPr>
-            <w:tcW w:type="dxa" w:w="2556"/>
+            <w:tcW w:type="dxa" w:w="3324"/>
             <w:shd w:fill="FFFFFF" w:color="auto" w:val="clear"/>
             <w:tcMar>
               <w:top w:type="dxa" w:w="60"/>
@@ -19268,7 +19435,7 @@
         </w:tc>
         <w:tc>
           <w:tcPr>
-            <w:tcW w:type="dxa" w:w="2556"/>
+            <w:tcW w:type="dxa" w:w="2300"/>
             <w:shd w:fill="F2F2F2" w:color="auto" w:val="clear"/>
             <w:tcMar>
               <w:top w:type="dxa" w:w="60"/>
@@ -19319,7 +19486,7 @@
         </w:tc>
         <w:tc>
           <w:tcPr>
-            <w:tcW w:type="dxa" w:w="2556"/>
+            <w:tcW w:type="dxa" w:w="2300"/>
             <w:shd w:fill="FFFFFF" w:color="auto" w:val="clear"/>
             <w:tcMar>
               <w:top w:type="dxa" w:w="60"/>
@@ -19404,7 +19571,7 @@
         </w:tc>
         <w:tc>
           <w:tcPr>
-            <w:tcW w:type="dxa" w:w="2556"/>
+            <w:tcW w:type="dxa" w:w="2300"/>
             <w:shd w:fill="FFFFFF" w:color="auto" w:val="clear"/>
             <w:tcMar>
               <w:top w:type="dxa" w:w="60"/>
@@ -19466,7 +19633,7 @@
             <w:pPr>
               <w:spacing w:after="20" w:before="0"/>
             </w:pPr>
-            <w:hyperlink w:history="1" r:id="rIdbf_owncuti0b44qkumhq3">
+            <w:hyperlink w:history="1" r:id="rIdlkai8you5bmwcw7ybzdsl">
               <w:r>
                 <w:rPr>
                   <w:rFonts w:ascii="Arial" w:cs="Arial" w:eastAsia="Arial" w:hAnsi="Arial"/>
@@ -19499,7 +19666,7 @@
               <w:spacing w:after="10" w:before="0"/>
               <w:ind w:left="120"/>
             </w:pPr>
-            <w:hyperlink w:history="1" r:id="rId0gvfnmvqkva1m_bv1kru3">
+            <w:hyperlink w:history="1" r:id="rIdgtv2romaubfzdenewkwrz">
               <w:r>
                 <w:rPr>
                   <w:rFonts w:ascii="Arial" w:cs="Arial" w:eastAsia="Arial" w:hAnsi="Arial"/>
@@ -19544,7 +19711,7 @@
             <w:pPr>
               <w:spacing w:after="20" w:before="0"/>
             </w:pPr>
-            <w:hyperlink w:history="1" r:id="rId_bzwcw3yxq-gvlemcmq6k">
+            <w:hyperlink w:history="1" r:id="rIdfqi3pwdnltrdxga2zcrpk">
               <w:r>
                 <w:rPr>
                   <w:rFonts w:ascii="Arial" w:cs="Arial" w:eastAsia="Arial" w:hAnsi="Arial"/>
@@ -19577,7 +19744,7 @@
               <w:spacing w:after="10" w:before="0"/>
               <w:ind w:left="120"/>
             </w:pPr>
-            <w:hyperlink w:history="1" r:id="rIdvikguz8hac6majbxj1ucz">
+            <w:hyperlink w:history="1" r:id="rIdp653kpcc1da6h9byule4j">
               <w:r>
                 <w:rPr>
                   <w:rFonts w:ascii="Arial" w:cs="Arial" w:eastAsia="Arial" w:hAnsi="Arial"/>
@@ -19593,7 +19760,7 @@
         </w:tc>
         <w:tc>
           <w:tcPr>
-            <w:tcW w:type="dxa" w:w="2556"/>
+            <w:tcW w:type="dxa" w:w="3324"/>
             <w:shd w:fill="FFFFFF" w:color="auto" w:val="clear"/>
             <w:tcMar>
               <w:top w:type="dxa" w:w="60"/>
@@ -19682,7 +19849,7 @@
         </w:tc>
         <w:tc>
           <w:tcPr>
-            <w:tcW w:type="dxa" w:w="2556"/>
+            <w:tcW w:type="dxa" w:w="2300"/>
             <w:shd w:fill="F2F2F2" w:color="auto" w:val="clear"/>
             <w:tcMar>
               <w:top w:type="dxa" w:w="60"/>
@@ -19714,7 +19881,7 @@
         </w:tc>
         <w:tc>
           <w:tcPr>
-            <w:tcW w:type="dxa" w:w="2556"/>
+            <w:tcW w:type="dxa" w:w="2300"/>
             <w:shd w:fill="FFFFFF" w:color="auto" w:val="clear"/>
             <w:tcMar>
               <w:top w:type="dxa" w:w="60"/>
@@ -19799,7 +19966,7 @@
         </w:tc>
         <w:tc>
           <w:tcPr>
-            <w:tcW w:type="dxa" w:w="2556"/>
+            <w:tcW w:type="dxa" w:w="2300"/>
             <w:shd w:fill="FFFFFF" w:color="auto" w:val="clear"/>
             <w:tcMar>
               <w:top w:type="dxa" w:w="60"/>
@@ -19861,7 +20028,7 @@
             <w:pPr>
               <w:spacing w:after="20" w:before="0"/>
             </w:pPr>
-            <w:hyperlink w:history="1" r:id="rId_lsfbxywmovkisq_y7o-u">
+            <w:hyperlink w:history="1" r:id="rIdudqtf4rudijloo7ydlzvy">
               <w:r>
                 <w:rPr>
                   <w:rFonts w:ascii="Arial" w:cs="Arial" w:eastAsia="Arial" w:hAnsi="Arial"/>
@@ -19894,7 +20061,7 @@
               <w:spacing w:after="10" w:before="0"/>
               <w:ind w:left="120"/>
             </w:pPr>
-            <w:hyperlink w:history="1" r:id="rIdc9pifrizencteaftl3puy">
+            <w:hyperlink w:history="1" r:id="rIdfj4j9tavxvkb-klg97wlm">
               <w:r>
                 <w:rPr>
                   <w:rFonts w:ascii="Arial" w:cs="Arial" w:eastAsia="Arial" w:hAnsi="Arial"/>
@@ -19939,7 +20106,7 @@
             <w:pPr>
               <w:spacing w:after="20" w:before="0"/>
             </w:pPr>
-            <w:hyperlink w:history="1" r:id="rIdsqowxlah28yhkkvt0rjiv">
+            <w:hyperlink w:history="1" r:id="rIdtbkvprw46uyxknoxi6zk1">
               <w:r>
                 <w:rPr>
                   <w:rFonts w:ascii="Arial" w:cs="Arial" w:eastAsia="Arial" w:hAnsi="Arial"/>
@@ -19972,7 +20139,7 @@
               <w:spacing w:after="10" w:before="0"/>
               <w:ind w:left="120"/>
             </w:pPr>
-            <w:hyperlink w:history="1" r:id="rIdc5yht5va90djypjawd0vu">
+            <w:hyperlink w:history="1" r:id="rIdcc8za7ur-ocsudtiqa-l1">
               <w:r>
                 <w:rPr>
                   <w:rFonts w:ascii="Arial" w:cs="Arial" w:eastAsia="Arial" w:hAnsi="Arial"/>
@@ -19988,7 +20155,7 @@
         </w:tc>
         <w:tc>
           <w:tcPr>
-            <w:tcW w:type="dxa" w:w="2556"/>
+            <w:tcW w:type="dxa" w:w="3324"/>
             <w:shd w:fill="FFFFFF" w:color="auto" w:val="clear"/>
             <w:tcMar>
               <w:top w:type="dxa" w:w="60"/>
@@ -20077,7 +20244,7 @@
         </w:tc>
         <w:tc>
           <w:tcPr>
-            <w:tcW w:type="dxa" w:w="2556"/>
+            <w:tcW w:type="dxa" w:w="2300"/>
             <w:shd w:fill="F2F2F2" w:color="auto" w:val="clear"/>
             <w:tcMar>
               <w:top w:type="dxa" w:w="60"/>
@@ -20128,7 +20295,7 @@
         </w:tc>
         <w:tc>
           <w:tcPr>
-            <w:tcW w:type="dxa" w:w="2556"/>
+            <w:tcW w:type="dxa" w:w="2300"/>
             <w:shd w:fill="FFFFFF" w:color="auto" w:val="clear"/>
             <w:tcMar>
               <w:top w:type="dxa" w:w="60"/>
@@ -20194,7 +20361,7 @@
         </w:tc>
         <w:tc>
           <w:tcPr>
-            <w:tcW w:type="dxa" w:w="2556"/>
+            <w:tcW w:type="dxa" w:w="2300"/>
             <w:shd w:fill="FFFFFF" w:color="auto" w:val="clear"/>
             <w:tcMar>
               <w:top w:type="dxa" w:w="60"/>
@@ -20256,7 +20423,7 @@
             <w:pPr>
               <w:spacing w:after="20" w:before="0"/>
             </w:pPr>
-            <w:hyperlink w:history="1" r:id="rIdb2blwgqjlzpuakhuwpnhf">
+            <w:hyperlink w:history="1" r:id="rIdkvkefzp8kbuo8lwksnb3a">
               <w:r>
                 <w:rPr>
                   <w:rFonts w:ascii="Arial" w:cs="Arial" w:eastAsia="Arial" w:hAnsi="Arial"/>
@@ -20289,7 +20456,7 @@
               <w:spacing w:after="10" w:before="0"/>
               <w:ind w:left="120"/>
             </w:pPr>
-            <w:hyperlink w:history="1" r:id="rIdfuiyeqc4cdpfg7ydgt_tf">
+            <w:hyperlink w:history="1" r:id="rId124st2e38cquxa6hd9dj5">
               <w:r>
                 <w:rPr>
                   <w:rFonts w:ascii="Arial" w:cs="Arial" w:eastAsia="Arial" w:hAnsi="Arial"/>
@@ -20334,7 +20501,7 @@
             <w:pPr>
               <w:spacing w:after="20" w:before="0"/>
             </w:pPr>
-            <w:hyperlink w:history="1" r:id="rIdwvmlcr7szvpl8pf4l-tdo">
+            <w:hyperlink w:history="1" r:id="rIdj-qtfgamllcojkykcladg">
               <w:r>
                 <w:rPr>
                   <w:rFonts w:ascii="Arial" w:cs="Arial" w:eastAsia="Arial" w:hAnsi="Arial"/>
@@ -20367,7 +20534,7 @@
               <w:spacing w:after="10" w:before="0"/>
               <w:ind w:left="120"/>
             </w:pPr>
-            <w:hyperlink w:history="1" r:id="rIdzr0jjkadvsqh9zk-m80gu">
+            <w:hyperlink w:history="1" r:id="rIdluccw6mell5vyxm1tkoce">
               <w:r>
                 <w:rPr>
                   <w:rFonts w:ascii="Arial" w:cs="Arial" w:eastAsia="Arial" w:hAnsi="Arial"/>
@@ -20383,7 +20550,7 @@
         </w:tc>
         <w:tc>
           <w:tcPr>
-            <w:tcW w:type="dxa" w:w="2556"/>
+            <w:tcW w:type="dxa" w:w="3324"/>
             <w:shd w:fill="FFFFFF" w:color="auto" w:val="clear"/>
             <w:tcMar>
               <w:top w:type="dxa" w:w="60"/>
@@ -20472,7 +20639,7 @@
         </w:tc>
         <w:tc>
           <w:tcPr>
-            <w:tcW w:type="dxa" w:w="2556"/>
+            <w:tcW w:type="dxa" w:w="2300"/>
             <w:shd w:fill="F2F2F2" w:color="auto" w:val="clear"/>
             <w:tcMar>
               <w:top w:type="dxa" w:w="60"/>
@@ -20504,7 +20671,7 @@
         </w:tc>
         <w:tc>
           <w:tcPr>
-            <w:tcW w:type="dxa" w:w="2556"/>
+            <w:tcW w:type="dxa" w:w="2300"/>
             <w:shd w:fill="FFFFFF" w:color="auto" w:val="clear"/>
             <w:tcMar>
               <w:top w:type="dxa" w:w="60"/>
@@ -20570,7 +20737,7 @@
         </w:tc>
         <w:tc>
           <w:tcPr>
-            <w:tcW w:type="dxa" w:w="2556"/>
+            <w:tcW w:type="dxa" w:w="2300"/>
             <w:shd w:fill="FFFFFF" w:color="auto" w:val="clear"/>
             <w:tcMar>
               <w:top w:type="dxa" w:w="60"/>
@@ -20632,7 +20799,7 @@
             <w:pPr>
               <w:spacing w:after="20" w:before="0"/>
             </w:pPr>
-            <w:hyperlink w:history="1" r:id="rIdhbk5p6cxnzgsyih8zd9px">
+            <w:hyperlink w:history="1" r:id="rIdhsyy2u4t0bysorbcqen12">
               <w:r>
                 <w:rPr>
                   <w:rFonts w:ascii="Arial" w:cs="Arial" w:eastAsia="Arial" w:hAnsi="Arial"/>
@@ -20665,7 +20832,7 @@
               <w:spacing w:after="10" w:before="0"/>
               <w:ind w:left="120"/>
             </w:pPr>
-            <w:hyperlink w:history="1" r:id="rIdmjcck7opkkkrpgda2-21o">
+            <w:hyperlink w:history="1" r:id="rIdvfs3tzcps3llplc8zj6k_">
               <w:r>
                 <w:rPr>
                   <w:rFonts w:ascii="Arial" w:cs="Arial" w:eastAsia="Arial" w:hAnsi="Arial"/>
@@ -20710,7 +20877,7 @@
             <w:pPr>
               <w:spacing w:after="20" w:before="0"/>
             </w:pPr>
-            <w:hyperlink w:history="1" r:id="rIdad0_ejdaxnopkriqjosym">
+            <w:hyperlink w:history="1" r:id="rIdjgraywi9yzdzl-12ijy7h">
               <w:r>
                 <w:rPr>
                   <w:rFonts w:ascii="Arial" w:cs="Arial" w:eastAsia="Arial" w:hAnsi="Arial"/>
@@ -20743,7 +20910,7 @@
               <w:spacing w:after="10" w:before="0"/>
               <w:ind w:left="120"/>
             </w:pPr>
-            <w:hyperlink w:history="1" r:id="rIduzzdhwu4sq57xqs__9kbz">
+            <w:hyperlink w:history="1" r:id="rIdofhngnrxtwamawqmm3rtr">
               <w:r>
                 <w:rPr>
                   <w:rFonts w:ascii="Arial" w:cs="Arial" w:eastAsia="Arial" w:hAnsi="Arial"/>
@@ -20759,7 +20926,7 @@
         </w:tc>
         <w:tc>
           <w:tcPr>
-            <w:tcW w:type="dxa" w:w="2556"/>
+            <w:tcW w:type="dxa" w:w="3324"/>
             <w:shd w:fill="FFFFFF" w:color="auto" w:val="clear"/>
             <w:tcMar>
               <w:top w:type="dxa" w:w="60"/>
@@ -20829,7 +20996,7 @@
         </w:tc>
         <w:tc>
           <w:tcPr>
-            <w:tcW w:type="dxa" w:w="2556"/>
+            <w:tcW w:type="dxa" w:w="2300"/>
             <w:shd w:fill="F2F2F2" w:color="auto" w:val="clear"/>
             <w:tcMar>
               <w:top w:type="dxa" w:w="60"/>
@@ -20861,7 +21028,7 @@
         </w:tc>
         <w:tc>
           <w:tcPr>
-            <w:tcW w:type="dxa" w:w="2556"/>
+            <w:tcW w:type="dxa" w:w="2300"/>
             <w:shd w:fill="FFFFFF" w:color="auto" w:val="clear"/>
             <w:tcMar>
               <w:top w:type="dxa" w:w="60"/>
@@ -22402,11 +22569,11 @@
       </w:tblPr>
       <w:tblGrid>
         <w:gridCol w:w="900"/>
+        <w:gridCol w:w="2300"/>
         <w:gridCol w:w="2556"/>
-        <w:gridCol w:w="2556"/>
-        <w:gridCol w:w="2556"/>
-        <w:gridCol w:w="2556"/>
-        <w:gridCol w:w="2556"/>
+        <w:gridCol w:w="3324"/>
+        <w:gridCol w:w="2300"/>
+        <w:gridCol w:w="2300"/>
       </w:tblGrid>
       <w:tr>
         <w:tc>
@@ -22478,7 +22645,7 @@
         </w:tc>
         <w:tc>
           <w:tcPr>
-            <w:tcW w:type="dxa" w:w="2556"/>
+            <w:tcW w:type="dxa" w:w="2300"/>
             <w:shd w:fill="2E75B6" w:color="auto" w:val="clear"/>
             <w:tcMar>
               <w:top w:type="dxa" w:w="60"/>
@@ -22542,7 +22709,7 @@
         </w:tc>
         <w:tc>
           <w:tcPr>
-            <w:tcW w:type="dxa" w:w="2556"/>
+            <w:tcW w:type="dxa" w:w="3324"/>
             <w:shd w:fill="2E75B6" w:color="auto" w:val="clear"/>
             <w:tcMar>
               <w:top w:type="dxa" w:w="60"/>
@@ -22574,7 +22741,7 @@
         </w:tc>
         <w:tc>
           <w:tcPr>
-            <w:tcW w:type="dxa" w:w="2556"/>
+            <w:tcW w:type="dxa" w:w="2300"/>
             <w:shd w:fill="1F6B75" w:color="auto" w:val="clear"/>
             <w:tcMar>
               <w:top w:type="dxa" w:w="60"/>
@@ -22606,7 +22773,7 @@
         </w:tc>
         <w:tc>
           <w:tcPr>
-            <w:tcW w:type="dxa" w:w="2556"/>
+            <w:tcW w:type="dxa" w:w="2300"/>
             <w:shd w:fill="2E75B6" w:color="auto" w:val="clear"/>
             <w:tcMar>
               <w:top w:type="dxa" w:w="60"/>
@@ -22672,7 +22839,7 @@
         </w:tc>
         <w:tc>
           <w:tcPr>
-            <w:tcW w:type="dxa" w:w="2556"/>
+            <w:tcW w:type="dxa" w:w="2300"/>
             <w:shd w:fill="FFFFFF" w:color="auto" w:val="clear"/>
             <w:tcMar>
               <w:top w:type="dxa" w:w="60"/>
@@ -22734,7 +22901,7 @@
             <w:pPr>
               <w:spacing w:after="20" w:before="0"/>
             </w:pPr>
-            <w:hyperlink w:history="1" r:id="rId-lbjzwaic5ryjfajlhhr-">
+            <w:hyperlink w:history="1" r:id="rIddxpfjnhnydqocmydijzsl">
               <w:r>
                 <w:rPr>
                   <w:rFonts w:ascii="Arial" w:cs="Arial" w:eastAsia="Arial" w:hAnsi="Arial"/>
@@ -22767,7 +22934,7 @@
               <w:spacing w:after="10" w:before="0"/>
               <w:ind w:left="120"/>
             </w:pPr>
-            <w:hyperlink w:history="1" r:id="rIdtpqlxn3dq2jyafphpjkkf">
+            <w:hyperlink w:history="1" r:id="rIdvhemvxbph_vfqcdtovyhq">
               <w:r>
                 <w:rPr>
                   <w:rFonts w:ascii="Arial" w:cs="Arial" w:eastAsia="Arial" w:hAnsi="Arial"/>
@@ -22812,7 +22979,7 @@
             <w:pPr>
               <w:spacing w:after="20" w:before="0"/>
             </w:pPr>
-            <w:hyperlink w:history="1" r:id="rIdhinjblla9xx0qnd8oz_ew">
+            <w:hyperlink w:history="1" r:id="rId_sbh6dgd05knf21ci2nxt">
               <w:r>
                 <w:rPr>
                   <w:rFonts w:ascii="Arial" w:cs="Arial" w:eastAsia="Arial" w:hAnsi="Arial"/>
@@ -22845,7 +23012,7 @@
               <w:spacing w:after="10" w:before="0"/>
               <w:ind w:left="120"/>
             </w:pPr>
-            <w:hyperlink w:history="1" r:id="rIdslbzrwvuagafjaxwmp3jo">
+            <w:hyperlink w:history="1" r:id="rIdegxw5nzylaphqu-9d27hs">
               <w:r>
                 <w:rPr>
                   <w:rFonts w:ascii="Arial" w:cs="Arial" w:eastAsia="Arial" w:hAnsi="Arial"/>
@@ -22861,7 +23028,7 @@
         </w:tc>
         <w:tc>
           <w:tcPr>
-            <w:tcW w:type="dxa" w:w="2556"/>
+            <w:tcW w:type="dxa" w:w="3324"/>
             <w:shd w:fill="FFFFFF" w:color="auto" w:val="clear"/>
             <w:tcMar>
               <w:top w:type="dxa" w:w="60"/>
@@ -22931,7 +23098,7 @@
         </w:tc>
         <w:tc>
           <w:tcPr>
-            <w:tcW w:type="dxa" w:w="2556"/>
+            <w:tcW w:type="dxa" w:w="2300"/>
             <w:shd w:fill="F2F2F2" w:color="auto" w:val="clear"/>
             <w:tcMar>
               <w:top w:type="dxa" w:w="60"/>
@@ -22982,7 +23149,7 @@
         </w:tc>
         <w:tc>
           <w:tcPr>
-            <w:tcW w:type="dxa" w:w="2556"/>
+            <w:tcW w:type="dxa" w:w="2300"/>
             <w:shd w:fill="FFFFFF" w:color="auto" w:val="clear"/>
             <w:tcMar>
               <w:top w:type="dxa" w:w="60"/>
@@ -23048,7 +23215,7 @@
         </w:tc>
         <w:tc>
           <w:tcPr>
-            <w:tcW w:type="dxa" w:w="2556"/>
+            <w:tcW w:type="dxa" w:w="2300"/>
             <w:shd w:fill="FFFFFF" w:color="auto" w:val="clear"/>
             <w:tcMar>
               <w:top w:type="dxa" w:w="60"/>
@@ -23148,7 +23315,7 @@
             <w:pPr>
               <w:spacing w:after="20" w:before="0"/>
             </w:pPr>
-            <w:hyperlink w:history="1" r:id="rIdgysiicrppfgdgluuq50zv">
+            <w:hyperlink w:history="1" r:id="rIdcgdr7dbo1zznrd2lwfb6n">
               <w:r>
                 <w:rPr>
                   <w:rFonts w:ascii="Arial" w:cs="Arial" w:eastAsia="Arial" w:hAnsi="Arial"/>
@@ -23181,7 +23348,7 @@
               <w:spacing w:after="10" w:before="0"/>
               <w:ind w:left="120"/>
             </w:pPr>
-            <w:hyperlink w:history="1" r:id="rIdcwhmr64xb_soroax3x_he">
+            <w:hyperlink w:history="1" r:id="rIdj89x9gg6uuit2tqu8-fih">
               <w:r>
                 <w:rPr>
                   <w:rFonts w:ascii="Arial" w:cs="Arial" w:eastAsia="Arial" w:hAnsi="Arial"/>
@@ -23226,7 +23393,7 @@
             <w:pPr>
               <w:spacing w:after="20" w:before="0"/>
             </w:pPr>
-            <w:hyperlink w:history="1" r:id="rIdu8mspru3-tdqudckaywwb">
+            <w:hyperlink w:history="1" r:id="rIduaglw30zzlwgpzhj4v5hy">
               <w:r>
                 <w:rPr>
                   <w:rFonts w:ascii="Arial" w:cs="Arial" w:eastAsia="Arial" w:hAnsi="Arial"/>
@@ -23259,7 +23426,7 @@
               <w:spacing w:after="10" w:before="0"/>
               <w:ind w:left="120"/>
             </w:pPr>
-            <w:hyperlink w:history="1" r:id="rId0hamf79vlnn_rdbjir99h">
+            <w:hyperlink w:history="1" r:id="rIdbwbaxitcyaycozcmpnhmn">
               <w:r>
                 <w:rPr>
                   <w:rFonts w:ascii="Arial" w:cs="Arial" w:eastAsia="Arial" w:hAnsi="Arial"/>
@@ -23275,7 +23442,7 @@
         </w:tc>
         <w:tc>
           <w:tcPr>
-            <w:tcW w:type="dxa" w:w="2556"/>
+            <w:tcW w:type="dxa" w:w="3324"/>
             <w:shd w:fill="FFFFFF" w:color="auto" w:val="clear"/>
             <w:tcMar>
               <w:top w:type="dxa" w:w="60"/>
@@ -23345,7 +23512,7 @@
         </w:tc>
         <w:tc>
           <w:tcPr>
-            <w:tcW w:type="dxa" w:w="2556"/>
+            <w:tcW w:type="dxa" w:w="2300"/>
             <w:shd w:fill="F2F2F2" w:color="auto" w:val="clear"/>
             <w:tcMar>
               <w:top w:type="dxa" w:w="60"/>
@@ -23396,7 +23563,7 @@
         </w:tc>
         <w:tc>
           <w:tcPr>
-            <w:tcW w:type="dxa" w:w="2556"/>
+            <w:tcW w:type="dxa" w:w="2300"/>
             <w:shd w:fill="FFFFFF" w:color="auto" w:val="clear"/>
             <w:tcMar>
               <w:top w:type="dxa" w:w="60"/>
@@ -23462,7 +23629,7 @@
         </w:tc>
         <w:tc>
           <w:tcPr>
-            <w:tcW w:type="dxa" w:w="2556"/>
+            <w:tcW w:type="dxa" w:w="2300"/>
             <w:shd w:fill="FFFFFF" w:color="auto" w:val="clear"/>
             <w:tcMar>
               <w:top w:type="dxa" w:w="60"/>
@@ -23524,7 +23691,7 @@
             <w:pPr>
               <w:spacing w:after="20" w:before="0"/>
             </w:pPr>
-            <w:hyperlink w:history="1" r:id="rIdntiv9rjz4elqybfxtkwfw">
+            <w:hyperlink w:history="1" r:id="rIdchaigredtyguijjjlipn6">
               <w:r>
                 <w:rPr>
                   <w:rFonts w:ascii="Arial" w:cs="Arial" w:eastAsia="Arial" w:hAnsi="Arial"/>
@@ -23557,7 +23724,7 @@
               <w:spacing w:after="10" w:before="0"/>
               <w:ind w:left="120"/>
             </w:pPr>
-            <w:hyperlink w:history="1" r:id="rIdsiooounfpysoci8fodv6z">
+            <w:hyperlink w:history="1" r:id="rIdolmxjurbncbgwkc9yijxr">
               <w:r>
                 <w:rPr>
                   <w:rFonts w:ascii="Arial" w:cs="Arial" w:eastAsia="Arial" w:hAnsi="Arial"/>
@@ -23602,7 +23769,7 @@
             <w:pPr>
               <w:spacing w:after="20" w:before="0"/>
             </w:pPr>
-            <w:hyperlink w:history="1" r:id="rId4fhlhs6k_yf61pqx3j21n">
+            <w:hyperlink w:history="1" r:id="rIdwwb5xqmpfqpf9lkgwwaxr">
               <w:r>
                 <w:rPr>
                   <w:rFonts w:ascii="Arial" w:cs="Arial" w:eastAsia="Arial" w:hAnsi="Arial"/>
@@ -23635,7 +23802,7 @@
               <w:spacing w:after="10" w:before="0"/>
               <w:ind w:left="120"/>
             </w:pPr>
-            <w:hyperlink w:history="1" r:id="rIddwjvhutwsupogpgo6gamj">
+            <w:hyperlink w:history="1" r:id="rIdtzvgwjbcjmisrsoe_hvwf">
               <w:r>
                 <w:rPr>
                   <w:rFonts w:ascii="Arial" w:cs="Arial" w:eastAsia="Arial" w:hAnsi="Arial"/>
@@ -23651,7 +23818,7 @@
         </w:tc>
         <w:tc>
           <w:tcPr>
-            <w:tcW w:type="dxa" w:w="2556"/>
+            <w:tcW w:type="dxa" w:w="3324"/>
             <w:shd w:fill="FFFFFF" w:color="auto" w:val="clear"/>
             <w:tcMar>
               <w:top w:type="dxa" w:w="60"/>
@@ -23721,7 +23888,7 @@
         </w:tc>
         <w:tc>
           <w:tcPr>
-            <w:tcW w:type="dxa" w:w="2556"/>
+            <w:tcW w:type="dxa" w:w="2300"/>
             <w:shd w:fill="F2F2F2" w:color="auto" w:val="clear"/>
             <w:tcMar>
               <w:top w:type="dxa" w:w="60"/>
@@ -23772,7 +23939,7 @@
         </w:tc>
         <w:tc>
           <w:tcPr>
-            <w:tcW w:type="dxa" w:w="2556"/>
+            <w:tcW w:type="dxa" w:w="2300"/>
             <w:shd w:fill="FFFFFF" w:color="auto" w:val="clear"/>
             <w:tcMar>
               <w:top w:type="dxa" w:w="60"/>
@@ -23838,7 +24005,7 @@
         </w:tc>
         <w:tc>
           <w:tcPr>
-            <w:tcW w:type="dxa" w:w="2556"/>
+            <w:tcW w:type="dxa" w:w="2300"/>
             <w:shd w:fill="FFFFFF" w:color="auto" w:val="clear"/>
             <w:tcMar>
               <w:top w:type="dxa" w:w="60"/>
@@ -23900,7 +24067,7 @@
             <w:pPr>
               <w:spacing w:after="20" w:before="0"/>
             </w:pPr>
-            <w:hyperlink w:history="1" r:id="rId33a4qvsstwms01fprqpmb">
+            <w:hyperlink w:history="1" r:id="rIdbvid3td7jupjvu448gfhj">
               <w:r>
                 <w:rPr>
                   <w:rFonts w:ascii="Arial" w:cs="Arial" w:eastAsia="Arial" w:hAnsi="Arial"/>
@@ -23933,7 +24100,7 @@
               <w:spacing w:after="10" w:before="0"/>
               <w:ind w:left="120"/>
             </w:pPr>
-            <w:hyperlink w:history="1" r:id="rIdy5iii23omfvotd8oznwxh">
+            <w:hyperlink w:history="1" r:id="rIdgvqnl5rqv-bkzzb1lmacz">
               <w:r>
                 <w:rPr>
                   <w:rFonts w:ascii="Arial" w:cs="Arial" w:eastAsia="Arial" w:hAnsi="Arial"/>
@@ -23978,7 +24145,7 @@
             <w:pPr>
               <w:spacing w:after="20" w:before="0"/>
             </w:pPr>
-            <w:hyperlink w:history="1" r:id="rIdsdzhrnv3hmwjgcqiz18ji">
+            <w:hyperlink w:history="1" r:id="rIdoqhgri8dfrxzogkk1iu7i">
               <w:r>
                 <w:rPr>
                   <w:rFonts w:ascii="Arial" w:cs="Arial" w:eastAsia="Arial" w:hAnsi="Arial"/>
@@ -24011,7 +24178,7 @@
               <w:spacing w:after="10" w:before="0"/>
               <w:ind w:left="120"/>
             </w:pPr>
-            <w:hyperlink w:history="1" r:id="rId4xpjqnbk5kzqutwhusjvx">
+            <w:hyperlink w:history="1" r:id="rIdsxwgyjzlyngezg2f6wbu8">
               <w:r>
                 <w:rPr>
                   <w:rFonts w:ascii="Arial" w:cs="Arial" w:eastAsia="Arial" w:hAnsi="Arial"/>
@@ -24027,7 +24194,7 @@
         </w:tc>
         <w:tc>
           <w:tcPr>
-            <w:tcW w:type="dxa" w:w="2556"/>
+            <w:tcW w:type="dxa" w:w="3324"/>
             <w:shd w:fill="FFFFFF" w:color="auto" w:val="clear"/>
             <w:tcMar>
               <w:top w:type="dxa" w:w="60"/>
@@ -24078,7 +24245,7 @@
         </w:tc>
         <w:tc>
           <w:tcPr>
-            <w:tcW w:type="dxa" w:w="2556"/>
+            <w:tcW w:type="dxa" w:w="2300"/>
             <w:shd w:fill="F2F2F2" w:color="auto" w:val="clear"/>
             <w:tcMar>
               <w:top w:type="dxa" w:w="60"/>
@@ -24110,7 +24277,7 @@
         </w:tc>
         <w:tc>
           <w:tcPr>
-            <w:tcW w:type="dxa" w:w="2556"/>
+            <w:tcW w:type="dxa" w:w="2300"/>
             <w:shd w:fill="FFFFFF" w:color="auto" w:val="clear"/>
             <w:tcMar>
               <w:top w:type="dxa" w:w="60"/>
@@ -24176,7 +24343,7 @@
         </w:tc>
         <w:tc>
           <w:tcPr>
-            <w:tcW w:type="dxa" w:w="2556"/>
+            <w:tcW w:type="dxa" w:w="2300"/>
             <w:shd w:fill="FFFFFF" w:color="auto" w:val="clear"/>
             <w:tcMar>
               <w:top w:type="dxa" w:w="60"/>
@@ -24238,7 +24405,7 @@
             <w:pPr>
               <w:spacing w:after="20" w:before="0"/>
             </w:pPr>
-            <w:hyperlink w:history="1" r:id="rIdu4hcwm9q5fyanaao7qdij">
+            <w:hyperlink w:history="1" r:id="rIdtqabbeghz41-aqpqmgqng">
               <w:r>
                 <w:rPr>
                   <w:rFonts w:ascii="Arial" w:cs="Arial" w:eastAsia="Arial" w:hAnsi="Arial"/>
@@ -24271,7 +24438,7 @@
               <w:spacing w:after="10" w:before="0"/>
               <w:ind w:left="120"/>
             </w:pPr>
-            <w:hyperlink w:history="1" r:id="rIdhmlj4-sthgxepasmx0b64">
+            <w:hyperlink w:history="1" r:id="rId7at6a0fy6xlkplsaxnpuj">
               <w:r>
                 <w:rPr>
                   <w:rFonts w:ascii="Arial" w:cs="Arial" w:eastAsia="Arial" w:hAnsi="Arial"/>
@@ -24316,7 +24483,7 @@
             <w:pPr>
               <w:spacing w:after="20" w:before="0"/>
             </w:pPr>
-            <w:hyperlink w:history="1" r:id="rIduhfxh17jsf7pqgfe823dh">
+            <w:hyperlink w:history="1" r:id="rIdba-svvf2-b1qfbr5rhlqe">
               <w:r>
                 <w:rPr>
                   <w:rFonts w:ascii="Arial" w:cs="Arial" w:eastAsia="Arial" w:hAnsi="Arial"/>
@@ -24349,7 +24516,7 @@
               <w:spacing w:after="10" w:before="0"/>
               <w:ind w:left="120"/>
             </w:pPr>
-            <w:hyperlink w:history="1" r:id="rIdkg2ikvt48tiut7dt-4sy4">
+            <w:hyperlink w:history="1" r:id="rIdmcjlcjm4mu1t6mzmge0lk">
               <w:r>
                 <w:rPr>
                   <w:rFonts w:ascii="Arial" w:cs="Arial" w:eastAsia="Arial" w:hAnsi="Arial"/>
@@ -24365,7 +24532,7 @@
         </w:tc>
         <w:tc>
           <w:tcPr>
-            <w:tcW w:type="dxa" w:w="2556"/>
+            <w:tcW w:type="dxa" w:w="3324"/>
             <w:shd w:fill="FFFFFF" w:color="auto" w:val="clear"/>
             <w:tcMar>
               <w:top w:type="dxa" w:w="60"/>
@@ -24435,7 +24602,7 @@
         </w:tc>
         <w:tc>
           <w:tcPr>
-            <w:tcW w:type="dxa" w:w="2556"/>
+            <w:tcW w:type="dxa" w:w="2300"/>
             <w:shd w:fill="F2F2F2" w:color="auto" w:val="clear"/>
             <w:tcMar>
               <w:top w:type="dxa" w:w="60"/>
@@ -24467,7 +24634,7 @@
         </w:tc>
         <w:tc>
           <w:tcPr>
-            <w:tcW w:type="dxa" w:w="2556"/>
+            <w:tcW w:type="dxa" w:w="2300"/>
             <w:shd w:fill="FFFFFF" w:color="auto" w:val="clear"/>
             <w:tcMar>
               <w:top w:type="dxa" w:w="60"/>
@@ -26069,11 +26236,11 @@
       </w:tblPr>
       <w:tblGrid>
         <w:gridCol w:w="900"/>
+        <w:gridCol w:w="2300"/>
         <w:gridCol w:w="2556"/>
-        <w:gridCol w:w="2556"/>
-        <w:gridCol w:w="2556"/>
-        <w:gridCol w:w="2556"/>
-        <w:gridCol w:w="2556"/>
+        <w:gridCol w:w="3324"/>
+        <w:gridCol w:w="2300"/>
+        <w:gridCol w:w="2300"/>
       </w:tblGrid>
       <w:tr>
         <w:tc>
@@ -26145,7 +26312,7 @@
         </w:tc>
         <w:tc>
           <w:tcPr>
-            <w:tcW w:type="dxa" w:w="2556"/>
+            <w:tcW w:type="dxa" w:w="2300"/>
             <w:shd w:fill="2E75B6" w:color="auto" w:val="clear"/>
             <w:tcMar>
               <w:top w:type="dxa" w:w="60"/>
@@ -26209,7 +26376,7 @@
         </w:tc>
         <w:tc>
           <w:tcPr>
-            <w:tcW w:type="dxa" w:w="2556"/>
+            <w:tcW w:type="dxa" w:w="3324"/>
             <w:shd w:fill="2E75B6" w:color="auto" w:val="clear"/>
             <w:tcMar>
               <w:top w:type="dxa" w:w="60"/>
@@ -26241,7 +26408,7 @@
         </w:tc>
         <w:tc>
           <w:tcPr>
-            <w:tcW w:type="dxa" w:w="2556"/>
+            <w:tcW w:type="dxa" w:w="2300"/>
             <w:shd w:fill="1F6B75" w:color="auto" w:val="clear"/>
             <w:tcMar>
               <w:top w:type="dxa" w:w="60"/>
@@ -26273,7 +26440,7 @@
         </w:tc>
         <w:tc>
           <w:tcPr>
-            <w:tcW w:type="dxa" w:w="2556"/>
+            <w:tcW w:type="dxa" w:w="2300"/>
             <w:shd w:fill="2E75B6" w:color="auto" w:val="clear"/>
             <w:tcMar>
               <w:top w:type="dxa" w:w="60"/>
@@ -26339,7 +26506,7 @@
         </w:tc>
         <w:tc>
           <w:tcPr>
-            <w:tcW w:type="dxa" w:w="2556"/>
+            <w:tcW w:type="dxa" w:w="2300"/>
             <w:shd w:fill="FFFFFF" w:color="auto" w:val="clear"/>
             <w:tcMar>
               <w:top w:type="dxa" w:w="60"/>
@@ -26401,7 +26568,7 @@
             <w:pPr>
               <w:spacing w:after="20" w:before="0"/>
             </w:pPr>
-            <w:hyperlink w:history="1" r:id="rIde3k_ev2lovkivta0syonj">
+            <w:hyperlink w:history="1" r:id="rIdh2ts7nip-5kl9piuleivn">
               <w:r>
                 <w:rPr>
                   <w:rFonts w:ascii="Arial" w:cs="Arial" w:eastAsia="Arial" w:hAnsi="Arial"/>
@@ -26434,7 +26601,7 @@
               <w:spacing w:after="10" w:before="0"/>
               <w:ind w:left="120"/>
             </w:pPr>
-            <w:hyperlink w:history="1" r:id="rIdtff8504hiyntkqnn-balr">
+            <w:hyperlink w:history="1" r:id="rIdqrh0ev27f72x9sghova_w">
               <w:r>
                 <w:rPr>
                   <w:rFonts w:ascii="Arial" w:cs="Arial" w:eastAsia="Arial" w:hAnsi="Arial"/>
@@ -26479,7 +26646,7 @@
             <w:pPr>
               <w:spacing w:after="20" w:before="0"/>
             </w:pPr>
-            <w:hyperlink w:history="1" r:id="rIdnjdobqrepk_rkjggqu9pj">
+            <w:hyperlink w:history="1" r:id="rId4xlhyzykwofmxm4u11waj">
               <w:r>
                 <w:rPr>
                   <w:rFonts w:ascii="Arial" w:cs="Arial" w:eastAsia="Arial" w:hAnsi="Arial"/>
@@ -26512,7 +26679,7 @@
               <w:spacing w:after="10" w:before="0"/>
               <w:ind w:left="120"/>
             </w:pPr>
-            <w:hyperlink w:history="1" r:id="rId_-jm7eirx2klw-rjpjgh5">
+            <w:hyperlink w:history="1" r:id="rIdvi6dyohd5-41hlojyzrwz">
               <w:r>
                 <w:rPr>
                   <w:rFonts w:ascii="Arial" w:cs="Arial" w:eastAsia="Arial" w:hAnsi="Arial"/>
@@ -26528,7 +26695,7 @@
         </w:tc>
         <w:tc>
           <w:tcPr>
-            <w:tcW w:type="dxa" w:w="2556"/>
+            <w:tcW w:type="dxa" w:w="3324"/>
             <w:shd w:fill="FFFFFF" w:color="auto" w:val="clear"/>
             <w:tcMar>
               <w:top w:type="dxa" w:w="60"/>
@@ -26598,7 +26765,7 @@
         </w:tc>
         <w:tc>
           <w:tcPr>
-            <w:tcW w:type="dxa" w:w="2556"/>
+            <w:tcW w:type="dxa" w:w="2300"/>
             <w:shd w:fill="F2F2F2" w:color="auto" w:val="clear"/>
             <w:tcMar>
               <w:top w:type="dxa" w:w="60"/>
@@ -26649,7 +26816,7 @@
         </w:tc>
         <w:tc>
           <w:tcPr>
-            <w:tcW w:type="dxa" w:w="2556"/>
+            <w:tcW w:type="dxa" w:w="2300"/>
             <w:shd w:fill="FFFFFF" w:color="auto" w:val="clear"/>
             <w:tcMar>
               <w:top w:type="dxa" w:w="60"/>
@@ -26715,7 +26882,7 @@
         </w:tc>
         <w:tc>
           <w:tcPr>
-            <w:tcW w:type="dxa" w:w="2556"/>
+            <w:tcW w:type="dxa" w:w="2300"/>
             <w:shd w:fill="FFFFFF" w:color="auto" w:val="clear"/>
             <w:tcMar>
               <w:top w:type="dxa" w:w="60"/>
@@ -26796,7 +26963,7 @@
             <w:pPr>
               <w:spacing w:after="20" w:before="0"/>
             </w:pPr>
-            <w:hyperlink w:history="1" r:id="rIdcb_zap6pq53gx0hym_qih">
+            <w:hyperlink w:history="1" r:id="rIdb2mevgm5vw-_q8nmhlh0p">
               <w:r>
                 <w:rPr>
                   <w:rFonts w:ascii="Arial" w:cs="Arial" w:eastAsia="Arial" w:hAnsi="Arial"/>
@@ -26829,7 +26996,7 @@
               <w:spacing w:after="10" w:before="0"/>
               <w:ind w:left="120"/>
             </w:pPr>
-            <w:hyperlink w:history="1" r:id="rIdolzksuh3-k4eig4hbvru9">
+            <w:hyperlink w:history="1" r:id="rId53bsa4hxzmcio81fhgdum">
               <w:r>
                 <w:rPr>
                   <w:rFonts w:ascii="Arial" w:cs="Arial" w:eastAsia="Arial" w:hAnsi="Arial"/>
@@ -26874,7 +27041,7 @@
             <w:pPr>
               <w:spacing w:after="20" w:before="0"/>
             </w:pPr>
-            <w:hyperlink w:history="1" r:id="rId1z41-gdaouuebplbbwuph">
+            <w:hyperlink w:history="1" r:id="rId-jesixzh-kqqec60uezvu">
               <w:r>
                 <w:rPr>
                   <w:rFonts w:ascii="Arial" w:cs="Arial" w:eastAsia="Arial" w:hAnsi="Arial"/>
@@ -26907,7 +27074,7 @@
               <w:spacing w:after="10" w:before="0"/>
               <w:ind w:left="120"/>
             </w:pPr>
-            <w:hyperlink w:history="1" r:id="rIdy_jiq1gbx3tkvzpr0js8t">
+            <w:hyperlink w:history="1" r:id="rIdmiwnmar7svzn7w5evacjh">
               <w:r>
                 <w:rPr>
                   <w:rFonts w:ascii="Arial" w:cs="Arial" w:eastAsia="Arial" w:hAnsi="Arial"/>
@@ -26923,7 +27090,7 @@
         </w:tc>
         <w:tc>
           <w:tcPr>
-            <w:tcW w:type="dxa" w:w="2556"/>
+            <w:tcW w:type="dxa" w:w="3324"/>
             <w:shd w:fill="FFFFFF" w:color="auto" w:val="clear"/>
             <w:tcMar>
               <w:top w:type="dxa" w:w="60"/>
@@ -26993,7 +27160,7 @@
         </w:tc>
         <w:tc>
           <w:tcPr>
-            <w:tcW w:type="dxa" w:w="2556"/>
+            <w:tcW w:type="dxa" w:w="2300"/>
             <w:shd w:fill="F2F2F2" w:color="auto" w:val="clear"/>
             <w:tcMar>
               <w:top w:type="dxa" w:w="60"/>
@@ -27025,7 +27192,7 @@
         </w:tc>
         <w:tc>
           <w:tcPr>
-            <w:tcW w:type="dxa" w:w="2556"/>
+            <w:tcW w:type="dxa" w:w="2300"/>
             <w:shd w:fill="FFFFFF" w:color="auto" w:val="clear"/>
             <w:tcMar>
               <w:top w:type="dxa" w:w="60"/>
@@ -27110,7 +27277,7 @@
         </w:tc>
         <w:tc>
           <w:tcPr>
-            <w:tcW w:type="dxa" w:w="2556"/>
+            <w:tcW w:type="dxa" w:w="2300"/>
             <w:shd w:fill="FFFFFF" w:color="auto" w:val="clear"/>
             <w:tcMar>
               <w:top w:type="dxa" w:w="60"/>
@@ -27172,7 +27339,7 @@
             <w:pPr>
               <w:spacing w:after="20" w:before="0"/>
             </w:pPr>
-            <w:hyperlink w:history="1" r:id="rId3fi1jat0fapaualkqvd3j">
+            <w:hyperlink w:history="1" r:id="rIdkatprj738fjhljsxehemy">
               <w:r>
                 <w:rPr>
                   <w:rFonts w:ascii="Arial" w:cs="Arial" w:eastAsia="Arial" w:hAnsi="Arial"/>
@@ -27205,7 +27372,7 @@
               <w:spacing w:after="10" w:before="0"/>
               <w:ind w:left="120"/>
             </w:pPr>
-            <w:hyperlink w:history="1" r:id="rIdbwn357s7gpr8pslrggkpj">
+            <w:hyperlink w:history="1" r:id="rIdms9uabehr_h13tz0h2qkd">
               <w:r>
                 <w:rPr>
                   <w:rFonts w:ascii="Arial" w:cs="Arial" w:eastAsia="Arial" w:hAnsi="Arial"/>
@@ -27250,7 +27417,7 @@
             <w:pPr>
               <w:spacing w:after="20" w:before="0"/>
             </w:pPr>
-            <w:hyperlink w:history="1" r:id="rIdumms-vpsfjet9o83covkt">
+            <w:hyperlink w:history="1" r:id="rIdlgb8de0gftlgjssxcyva0">
               <w:r>
                 <w:rPr>
                   <w:rFonts w:ascii="Arial" w:cs="Arial" w:eastAsia="Arial" w:hAnsi="Arial"/>
@@ -27283,7 +27450,7 @@
               <w:spacing w:after="10" w:before="0"/>
               <w:ind w:left="120"/>
             </w:pPr>
-            <w:hyperlink w:history="1" r:id="rIdq2myqb9l81kbthihmiww1">
+            <w:hyperlink w:history="1" r:id="rId5kp3xv0vo0kfxeot1soxw">
               <w:r>
                 <w:rPr>
                   <w:rFonts w:ascii="Arial" w:cs="Arial" w:eastAsia="Arial" w:hAnsi="Arial"/>
@@ -27299,7 +27466,7 @@
         </w:tc>
         <w:tc>
           <w:tcPr>
-            <w:tcW w:type="dxa" w:w="2556"/>
+            <w:tcW w:type="dxa" w:w="3324"/>
             <w:shd w:fill="FFFFFF" w:color="auto" w:val="clear"/>
             <w:tcMar>
               <w:top w:type="dxa" w:w="60"/>
@@ -27369,7 +27536,7 @@
         </w:tc>
         <w:tc>
           <w:tcPr>
-            <w:tcW w:type="dxa" w:w="2556"/>
+            <w:tcW w:type="dxa" w:w="2300"/>
             <w:shd w:fill="F2F2F2" w:color="auto" w:val="clear"/>
             <w:tcMar>
               <w:top w:type="dxa" w:w="60"/>
@@ -27401,7 +27568,7 @@
         </w:tc>
         <w:tc>
           <w:tcPr>
-            <w:tcW w:type="dxa" w:w="2556"/>
+            <w:tcW w:type="dxa" w:w="2300"/>
             <w:shd w:fill="FFFFFF" w:color="auto" w:val="clear"/>
             <w:tcMar>
               <w:top w:type="dxa" w:w="60"/>
@@ -27486,7 +27653,7 @@
         </w:tc>
         <w:tc>
           <w:tcPr>
-            <w:tcW w:type="dxa" w:w="2556"/>
+            <w:tcW w:type="dxa" w:w="2300"/>
             <w:shd w:fill="FFFFFF" w:color="auto" w:val="clear"/>
             <w:tcMar>
               <w:top w:type="dxa" w:w="60"/>
@@ -27548,7 +27715,7 @@
             <w:pPr>
               <w:spacing w:after="20" w:before="0"/>
             </w:pPr>
-            <w:hyperlink w:history="1" r:id="rId17pgz_yafputrezayyto4">
+            <w:hyperlink w:history="1" r:id="rId8vjo7qz7mc2wso_hxqtre">
               <w:r>
                 <w:rPr>
                   <w:rFonts w:ascii="Arial" w:cs="Arial" w:eastAsia="Arial" w:hAnsi="Arial"/>
@@ -27581,7 +27748,7 @@
               <w:spacing w:after="10" w:before="0"/>
               <w:ind w:left="120"/>
             </w:pPr>
-            <w:hyperlink w:history="1" r:id="rIdhiqrlkcbdfpkwkd_oedjx">
+            <w:hyperlink w:history="1" r:id="rId3iyolxlkze5l1ihgclecy">
               <w:r>
                 <w:rPr>
                   <w:rFonts w:ascii="Arial" w:cs="Arial" w:eastAsia="Arial" w:hAnsi="Arial"/>
@@ -27626,7 +27793,7 @@
             <w:pPr>
               <w:spacing w:after="20" w:before="0"/>
             </w:pPr>
-            <w:hyperlink w:history="1" r:id="rIdbake2moiim6jt_xi0ihsm">
+            <w:hyperlink w:history="1" r:id="rIdfkpfypykvavl6kaaraqwr">
               <w:r>
                 <w:rPr>
                   <w:rFonts w:ascii="Arial" w:cs="Arial" w:eastAsia="Arial" w:hAnsi="Arial"/>
@@ -27659,7 +27826,7 @@
               <w:spacing w:after="10" w:before="0"/>
               <w:ind w:left="120"/>
             </w:pPr>
-            <w:hyperlink w:history="1" r:id="rId_ucnkvj-9urbw7-yn2dtb">
+            <w:hyperlink w:history="1" r:id="rIdc5i-epvpbihla50pjawfo">
               <w:r>
                 <w:rPr>
                   <w:rFonts w:ascii="Arial" w:cs="Arial" w:eastAsia="Arial" w:hAnsi="Arial"/>
@@ -27675,7 +27842,7 @@
         </w:tc>
         <w:tc>
           <w:tcPr>
-            <w:tcW w:type="dxa" w:w="2556"/>
+            <w:tcW w:type="dxa" w:w="3324"/>
             <w:shd w:fill="FFFFFF" w:color="auto" w:val="clear"/>
             <w:tcMar>
               <w:top w:type="dxa" w:w="60"/>
@@ -27745,7 +27912,7 @@
         </w:tc>
         <w:tc>
           <w:tcPr>
-            <w:tcW w:type="dxa" w:w="2556"/>
+            <w:tcW w:type="dxa" w:w="2300"/>
             <w:shd w:fill="F2F2F2" w:color="auto" w:val="clear"/>
             <w:tcMar>
               <w:top w:type="dxa" w:w="60"/>
@@ -27796,7 +27963,7 @@
         </w:tc>
         <w:tc>
           <w:tcPr>
-            <w:tcW w:type="dxa" w:w="2556"/>
+            <w:tcW w:type="dxa" w:w="2300"/>
             <w:shd w:fill="FFFFFF" w:color="auto" w:val="clear"/>
             <w:tcMar>
               <w:top w:type="dxa" w:w="60"/>
@@ -27881,7 +28048,7 @@
         </w:tc>
         <w:tc>
           <w:tcPr>
-            <w:tcW w:type="dxa" w:w="2556"/>
+            <w:tcW w:type="dxa" w:w="2300"/>
             <w:shd w:fill="FFFFFF" w:color="auto" w:val="clear"/>
             <w:tcMar>
               <w:top w:type="dxa" w:w="60"/>
@@ -27943,7 +28110,7 @@
             <w:pPr>
               <w:spacing w:after="20" w:before="0"/>
             </w:pPr>
-            <w:hyperlink w:history="1" r:id="rIdz9iqsim7rql7l2njzotkg">
+            <w:hyperlink w:history="1" r:id="rIdvhsysmd_st_jx3kjz9iaw">
               <w:r>
                 <w:rPr>
                   <w:rFonts w:ascii="Arial" w:cs="Arial" w:eastAsia="Arial" w:hAnsi="Arial"/>
@@ -27976,7 +28143,7 @@
               <w:spacing w:after="10" w:before="0"/>
               <w:ind w:left="120"/>
             </w:pPr>
-            <w:hyperlink w:history="1" r:id="rIdakdr4ibupjs_6ka1kxubm">
+            <w:hyperlink w:history="1" r:id="rId8xmofhqpmz9swasg6pjnm">
               <w:r>
                 <w:rPr>
                   <w:rFonts w:ascii="Arial" w:cs="Arial" w:eastAsia="Arial" w:hAnsi="Arial"/>
@@ -28021,7 +28188,7 @@
             <w:pPr>
               <w:spacing w:after="20" w:before="0"/>
             </w:pPr>
-            <w:hyperlink w:history="1" r:id="rIdghz1uus_stgzcgakz5vcy">
+            <w:hyperlink w:history="1" r:id="rId_sheaerdzl1qbshm8uei0">
               <w:r>
                 <w:rPr>
                   <w:rFonts w:ascii="Arial" w:cs="Arial" w:eastAsia="Arial" w:hAnsi="Arial"/>
@@ -28054,7 +28221,7 @@
               <w:spacing w:after="10" w:before="0"/>
               <w:ind w:left="120"/>
             </w:pPr>
-            <w:hyperlink w:history="1" r:id="rIdn7xrhgffb8sx20rskn9nl">
+            <w:hyperlink w:history="1" r:id="rIdedi4styhfasqmuvxvhzfk">
               <w:r>
                 <w:rPr>
                   <w:rFonts w:ascii="Arial" w:cs="Arial" w:eastAsia="Arial" w:hAnsi="Arial"/>
@@ -28070,7 +28237,7 @@
         </w:tc>
         <w:tc>
           <w:tcPr>
-            <w:tcW w:type="dxa" w:w="2556"/>
+            <w:tcW w:type="dxa" w:w="3324"/>
             <w:shd w:fill="FFFFFF" w:color="auto" w:val="clear"/>
             <w:tcMar>
               <w:top w:type="dxa" w:w="60"/>
@@ -28121,7 +28288,7 @@
         </w:tc>
         <w:tc>
           <w:tcPr>
-            <w:tcW w:type="dxa" w:w="2556"/>
+            <w:tcW w:type="dxa" w:w="2300"/>
             <w:shd w:fill="F2F2F2" w:color="auto" w:val="clear"/>
             <w:tcMar>
               <w:top w:type="dxa" w:w="60"/>
@@ -28153,7 +28320,7 @@
         </w:tc>
         <w:tc>
           <w:tcPr>
-            <w:tcW w:type="dxa" w:w="2556"/>
+            <w:tcW w:type="dxa" w:w="2300"/>
             <w:shd w:fill="FFFFFF" w:color="auto" w:val="clear"/>
             <w:tcMar>
               <w:top w:type="dxa" w:w="60"/>
@@ -29713,11 +29880,11 @@
       </w:tblPr>
       <w:tblGrid>
         <w:gridCol w:w="900"/>
+        <w:gridCol w:w="2300"/>
         <w:gridCol w:w="2556"/>
-        <w:gridCol w:w="2556"/>
-        <w:gridCol w:w="2556"/>
-        <w:gridCol w:w="2556"/>
-        <w:gridCol w:w="2556"/>
+        <w:gridCol w:w="3324"/>
+        <w:gridCol w:w="2300"/>
+        <w:gridCol w:w="2300"/>
       </w:tblGrid>
       <w:tr>
         <w:tc>
@@ -29789,7 +29956,7 @@
         </w:tc>
         <w:tc>
           <w:tcPr>
-            <w:tcW w:type="dxa" w:w="2556"/>
+            <w:tcW w:type="dxa" w:w="2300"/>
             <w:shd w:fill="2E75B6" w:color="auto" w:val="clear"/>
             <w:tcMar>
               <w:top w:type="dxa" w:w="60"/>
@@ -29853,7 +30020,7 @@
         </w:tc>
         <w:tc>
           <w:tcPr>
-            <w:tcW w:type="dxa" w:w="2556"/>
+            <w:tcW w:type="dxa" w:w="3324"/>
             <w:shd w:fill="2E75B6" w:color="auto" w:val="clear"/>
             <w:tcMar>
               <w:top w:type="dxa" w:w="60"/>
@@ -29885,7 +30052,7 @@
         </w:tc>
         <w:tc>
           <w:tcPr>
-            <w:tcW w:type="dxa" w:w="2556"/>
+            <w:tcW w:type="dxa" w:w="2300"/>
             <w:shd w:fill="1F6B75" w:color="auto" w:val="clear"/>
             <w:tcMar>
               <w:top w:type="dxa" w:w="60"/>
@@ -29917,7 +30084,7 @@
         </w:tc>
         <w:tc>
           <w:tcPr>
-            <w:tcW w:type="dxa" w:w="2556"/>
+            <w:tcW w:type="dxa" w:w="2300"/>
             <w:shd w:fill="2E75B6" w:color="auto" w:val="clear"/>
             <w:tcMar>
               <w:top w:type="dxa" w:w="60"/>
@@ -29983,7 +30150,7 @@
         </w:tc>
         <w:tc>
           <w:tcPr>
-            <w:tcW w:type="dxa" w:w="2556"/>
+            <w:tcW w:type="dxa" w:w="2300"/>
             <w:shd w:fill="FFFFFF" w:color="auto" w:val="clear"/>
             <w:tcMar>
               <w:top w:type="dxa" w:w="60"/>
@@ -30045,7 +30212,7 @@
             <w:pPr>
               <w:spacing w:after="20" w:before="0"/>
             </w:pPr>
-            <w:hyperlink w:history="1" r:id="rIdpnlu__vsnnc1hlndp9yck">
+            <w:hyperlink w:history="1" r:id="rIdcqfzz0acpxn-oalglvju5">
               <w:r>
                 <w:rPr>
                   <w:rFonts w:ascii="Arial" w:cs="Arial" w:eastAsia="Arial" w:hAnsi="Arial"/>
@@ -30078,7 +30245,7 @@
               <w:spacing w:after="10" w:before="0"/>
               <w:ind w:left="120"/>
             </w:pPr>
-            <w:hyperlink w:history="1" r:id="rIdv01nlcoecu6ropna7d7-s">
+            <w:hyperlink w:history="1" r:id="rId8dbf0pdj5d0xzpywsyzpc">
               <w:r>
                 <w:rPr>
                   <w:rFonts w:ascii="Arial" w:cs="Arial" w:eastAsia="Arial" w:hAnsi="Arial"/>
@@ -30123,7 +30290,7 @@
             <w:pPr>
               <w:spacing w:after="20" w:before="0"/>
             </w:pPr>
-            <w:hyperlink w:history="1" r:id="rIdmx8yvrdd3ybznwmdtismp">
+            <w:hyperlink w:history="1" r:id="rIddwfmx48_-vqscg1kwugfc">
               <w:r>
                 <w:rPr>
                   <w:rFonts w:ascii="Arial" w:cs="Arial" w:eastAsia="Arial" w:hAnsi="Arial"/>
@@ -30156,7 +30323,7 @@
               <w:spacing w:after="10" w:before="0"/>
               <w:ind w:left="120"/>
             </w:pPr>
-            <w:hyperlink w:history="1" r:id="rIdulxdc43xy-llku_arfhh1">
+            <w:hyperlink w:history="1" r:id="rIdmodlsrd5fatwjyroev3e3">
               <w:r>
                 <w:rPr>
                   <w:rFonts w:ascii="Arial" w:cs="Arial" w:eastAsia="Arial" w:hAnsi="Arial"/>
@@ -30172,7 +30339,7 @@
         </w:tc>
         <w:tc>
           <w:tcPr>
-            <w:tcW w:type="dxa" w:w="2556"/>
+            <w:tcW w:type="dxa" w:w="3324"/>
             <w:shd w:fill="FFFFFF" w:color="auto" w:val="clear"/>
             <w:tcMar>
               <w:top w:type="dxa" w:w="60"/>
@@ -30242,7 +30409,7 @@
         </w:tc>
         <w:tc>
           <w:tcPr>
-            <w:tcW w:type="dxa" w:w="2556"/>
+            <w:tcW w:type="dxa" w:w="2300"/>
             <w:shd w:fill="F2F2F2" w:color="auto" w:val="clear"/>
             <w:tcMar>
               <w:top w:type="dxa" w:w="60"/>
@@ -30274,7 +30441,7 @@
         </w:tc>
         <w:tc>
           <w:tcPr>
-            <w:tcW w:type="dxa" w:w="2556"/>
+            <w:tcW w:type="dxa" w:w="2300"/>
             <w:shd w:fill="FFFFFF" w:color="auto" w:val="clear"/>
             <w:tcMar>
               <w:top w:type="dxa" w:w="60"/>
@@ -30340,7 +30507,7 @@
         </w:tc>
         <w:tc>
           <w:tcPr>
-            <w:tcW w:type="dxa" w:w="2556"/>
+            <w:tcW w:type="dxa" w:w="2300"/>
             <w:shd w:fill="FFFFFF" w:color="auto" w:val="clear"/>
             <w:tcMar>
               <w:top w:type="dxa" w:w="60"/>
@@ -30402,7 +30569,7 @@
             <w:pPr>
               <w:spacing w:after="20" w:before="0"/>
             </w:pPr>
-            <w:hyperlink w:history="1" r:id="rIdirp3dqhruxnlkjnavla4b">
+            <w:hyperlink w:history="1" r:id="rIdmobdxvucskadvjoufmfhb">
               <w:r>
                 <w:rPr>
                   <w:rFonts w:ascii="Arial" w:cs="Arial" w:eastAsia="Arial" w:hAnsi="Arial"/>
@@ -30435,7 +30602,7 @@
               <w:spacing w:after="10" w:before="0"/>
               <w:ind w:left="120"/>
             </w:pPr>
-            <w:hyperlink w:history="1" r:id="rIdebtphiqtq8k2b8kp8y4vy">
+            <w:hyperlink w:history="1" r:id="rIdm6_taro2xuopjhqhjd5bv">
               <w:r>
                 <w:rPr>
                   <w:rFonts w:ascii="Arial" w:cs="Arial" w:eastAsia="Arial" w:hAnsi="Arial"/>
@@ -30480,7 +30647,7 @@
             <w:pPr>
               <w:spacing w:after="20" w:before="0"/>
             </w:pPr>
-            <w:hyperlink w:history="1" r:id="rId79tbdzsz3xl-l7tuw4wxy">
+            <w:hyperlink w:history="1" r:id="rId5fngxqx8shcdbxba1jqcf">
               <w:r>
                 <w:rPr>
                   <w:rFonts w:ascii="Arial" w:cs="Arial" w:eastAsia="Arial" w:hAnsi="Arial"/>
@@ -30513,7 +30680,7 @@
               <w:spacing w:after="10" w:before="0"/>
               <w:ind w:left="120"/>
             </w:pPr>
-            <w:hyperlink w:history="1" r:id="rIdjjp6p8hnb9p8yixwp-5_p">
+            <w:hyperlink w:history="1" r:id="rId9gglraeixtpmkdqdvgw5x">
               <w:r>
                 <w:rPr>
                   <w:rFonts w:ascii="Arial" w:cs="Arial" w:eastAsia="Arial" w:hAnsi="Arial"/>
@@ -30529,7 +30696,7 @@
         </w:tc>
         <w:tc>
           <w:tcPr>
-            <w:tcW w:type="dxa" w:w="2556"/>
+            <w:tcW w:type="dxa" w:w="3324"/>
             <w:shd w:fill="FFFFFF" w:color="auto" w:val="clear"/>
             <w:tcMar>
               <w:top w:type="dxa" w:w="60"/>
@@ -30580,7 +30747,7 @@
         </w:tc>
         <w:tc>
           <w:tcPr>
-            <w:tcW w:type="dxa" w:w="2556"/>
+            <w:tcW w:type="dxa" w:w="2300"/>
             <w:shd w:fill="F2F2F2" w:color="auto" w:val="clear"/>
             <w:tcMar>
               <w:top w:type="dxa" w:w="60"/>
@@ -30631,7 +30798,7 @@
         </w:tc>
         <w:tc>
           <w:tcPr>
-            <w:tcW w:type="dxa" w:w="2556"/>
+            <w:tcW w:type="dxa" w:w="2300"/>
             <w:shd w:fill="FFFFFF" w:color="auto" w:val="clear"/>
             <w:tcMar>
               <w:top w:type="dxa" w:w="60"/>
@@ -30716,7 +30883,7 @@
         </w:tc>
         <w:tc>
           <w:tcPr>
-            <w:tcW w:type="dxa" w:w="2556"/>
+            <w:tcW w:type="dxa" w:w="2300"/>
             <w:shd w:fill="FFFFFF" w:color="auto" w:val="clear"/>
             <w:tcMar>
               <w:top w:type="dxa" w:w="60"/>
@@ -30778,7 +30945,7 @@
             <w:pPr>
               <w:spacing w:after="20" w:before="0"/>
             </w:pPr>
-            <w:hyperlink w:history="1" r:id="rIdaucmjcsuwbcuxkmep_frh">
+            <w:hyperlink w:history="1" r:id="rId23pycnn-ltfst7wcbtawz">
               <w:r>
                 <w:rPr>
                   <w:rFonts w:ascii="Arial" w:cs="Arial" w:eastAsia="Arial" w:hAnsi="Arial"/>
@@ -30811,7 +30978,7 @@
               <w:spacing w:after="10" w:before="0"/>
               <w:ind w:left="120"/>
             </w:pPr>
-            <w:hyperlink w:history="1" r:id="rIdpd9yyrqqmd_sx6lvpozfk">
+            <w:hyperlink w:history="1" r:id="rIdahanbmwzrkewcpjczrzah">
               <w:r>
                 <w:rPr>
                   <w:rFonts w:ascii="Arial" w:cs="Arial" w:eastAsia="Arial" w:hAnsi="Arial"/>
@@ -30856,7 +31023,7 @@
             <w:pPr>
               <w:spacing w:after="20" w:before="0"/>
             </w:pPr>
-            <w:hyperlink w:history="1" r:id="rIdn2uhyaa8moplnmg6zsthn">
+            <w:hyperlink w:history="1" r:id="rIdte9btfkks4hzahd2witqn">
               <w:r>
                 <w:rPr>
                   <w:rFonts w:ascii="Arial" w:cs="Arial" w:eastAsia="Arial" w:hAnsi="Arial"/>
@@ -30889,7 +31056,7 @@
               <w:spacing w:after="10" w:before="0"/>
               <w:ind w:left="120"/>
             </w:pPr>
-            <w:hyperlink w:history="1" r:id="rIdrayrcfhdqsvjrwd3tsylm">
+            <w:hyperlink w:history="1" r:id="rIds-dnxm3qidbl3vzwjhqff">
               <w:r>
                 <w:rPr>
                   <w:rFonts w:ascii="Arial" w:cs="Arial" w:eastAsia="Arial" w:hAnsi="Arial"/>
@@ -30905,7 +31072,7 @@
         </w:tc>
         <w:tc>
           <w:tcPr>
-            <w:tcW w:type="dxa" w:w="2556"/>
+            <w:tcW w:type="dxa" w:w="3324"/>
             <w:shd w:fill="FFFFFF" w:color="auto" w:val="clear"/>
             <w:tcMar>
               <w:top w:type="dxa" w:w="60"/>
@@ -30975,7 +31142,7 @@
         </w:tc>
         <w:tc>
           <w:tcPr>
-            <w:tcW w:type="dxa" w:w="2556"/>
+            <w:tcW w:type="dxa" w:w="2300"/>
             <w:shd w:fill="F2F2F2" w:color="auto" w:val="clear"/>
             <w:tcMar>
               <w:top w:type="dxa" w:w="60"/>
@@ -31026,7 +31193,7 @@
         </w:tc>
         <w:tc>
           <w:tcPr>
-            <w:tcW w:type="dxa" w:w="2556"/>
+            <w:tcW w:type="dxa" w:w="2300"/>
             <w:shd w:fill="FFFFFF" w:color="auto" w:val="clear"/>
             <w:tcMar>
               <w:top w:type="dxa" w:w="60"/>
@@ -31092,7 +31259,7 @@
         </w:tc>
         <w:tc>
           <w:tcPr>
-            <w:tcW w:type="dxa" w:w="2556"/>
+            <w:tcW w:type="dxa" w:w="2300"/>
             <w:shd w:fill="FFFFFF" w:color="auto" w:val="clear"/>
             <w:tcMar>
               <w:top w:type="dxa" w:w="60"/>
@@ -31154,7 +31321,7 @@
             <w:pPr>
               <w:spacing w:after="20" w:before="0"/>
             </w:pPr>
-            <w:hyperlink w:history="1" r:id="rIdsvr50ejdbnrbrk_jh60r1">
+            <w:hyperlink w:history="1" r:id="rIdeyfl_hxdod2qwlor_xr7w">
               <w:r>
                 <w:rPr>
                   <w:rFonts w:ascii="Arial" w:cs="Arial" w:eastAsia="Arial" w:hAnsi="Arial"/>
@@ -31187,7 +31354,7 @@
               <w:spacing w:after="10" w:before="0"/>
               <w:ind w:left="120"/>
             </w:pPr>
-            <w:hyperlink w:history="1" r:id="rIdrlekvvmx7jbp98w2crnkr">
+            <w:hyperlink w:history="1" r:id="rIdofsi8w5tbvfgfg2wp9p0m">
               <w:r>
                 <w:rPr>
                   <w:rFonts w:ascii="Arial" w:cs="Arial" w:eastAsia="Arial" w:hAnsi="Arial"/>
@@ -31232,7 +31399,7 @@
             <w:pPr>
               <w:spacing w:after="20" w:before="0"/>
             </w:pPr>
-            <w:hyperlink w:history="1" r:id="rIdi6auq_a9jxohjnipdxtfv">
+            <w:hyperlink w:history="1" r:id="rIdc-spd7-kexw7cykdpci9b">
               <w:r>
                 <w:rPr>
                   <w:rFonts w:ascii="Arial" w:cs="Arial" w:eastAsia="Arial" w:hAnsi="Arial"/>
@@ -31265,7 +31432,7 @@
               <w:spacing w:after="10" w:before="0"/>
               <w:ind w:left="120"/>
             </w:pPr>
-            <w:hyperlink w:history="1" r:id="rIdhnwhaottkarfrtrangr5i">
+            <w:hyperlink w:history="1" r:id="rIdpsbamvoi2gckgfoemj6da">
               <w:r>
                 <w:rPr>
                   <w:rFonts w:ascii="Arial" w:cs="Arial" w:eastAsia="Arial" w:hAnsi="Arial"/>
@@ -31281,7 +31448,7 @@
         </w:tc>
         <w:tc>
           <w:tcPr>
-            <w:tcW w:type="dxa" w:w="2556"/>
+            <w:tcW w:type="dxa" w:w="3324"/>
             <w:shd w:fill="FFFFFF" w:color="auto" w:val="clear"/>
             <w:tcMar>
               <w:top w:type="dxa" w:w="60"/>
@@ -31351,7 +31518,7 @@
         </w:tc>
         <w:tc>
           <w:tcPr>
-            <w:tcW w:type="dxa" w:w="2556"/>
+            <w:tcW w:type="dxa" w:w="2300"/>
             <w:shd w:fill="F2F2F2" w:color="auto" w:val="clear"/>
             <w:tcMar>
               <w:top w:type="dxa" w:w="60"/>
@@ -31383,7 +31550,7 @@
         </w:tc>
         <w:tc>
           <w:tcPr>
-            <w:tcW w:type="dxa" w:w="2556"/>
+            <w:tcW w:type="dxa" w:w="2300"/>
             <w:shd w:fill="FFFFFF" w:color="auto" w:val="clear"/>
             <w:tcMar>
               <w:top w:type="dxa" w:w="60"/>
@@ -31449,7 +31616,7 @@
         </w:tc>
         <w:tc>
           <w:tcPr>
-            <w:tcW w:type="dxa" w:w="2556"/>
+            <w:tcW w:type="dxa" w:w="2300"/>
             <w:shd w:fill="FFFFFF" w:color="auto" w:val="clear"/>
             <w:tcMar>
               <w:top w:type="dxa" w:w="60"/>
@@ -31511,7 +31678,7 @@
             <w:pPr>
               <w:spacing w:after="20" w:before="0"/>
             </w:pPr>
-            <w:hyperlink w:history="1" r:id="rId0nxicuqnhopbrn82v1c0d">
+            <w:hyperlink w:history="1" r:id="rIdglqg4gg5ovl6eduegxfk5">
               <w:r>
                 <w:rPr>
                   <w:rFonts w:ascii="Arial" w:cs="Arial" w:eastAsia="Arial" w:hAnsi="Arial"/>
@@ -31544,7 +31711,7 @@
               <w:spacing w:after="10" w:before="0"/>
               <w:ind w:left="120"/>
             </w:pPr>
-            <w:hyperlink w:history="1" r:id="rIdxixuddyl0iiwxwbx6avyj">
+            <w:hyperlink w:history="1" r:id="rIdl6wdc8vqpipalzijov95d">
               <w:r>
                 <w:rPr>
                   <w:rFonts w:ascii="Arial" w:cs="Arial" w:eastAsia="Arial" w:hAnsi="Arial"/>
@@ -31589,7 +31756,7 @@
             <w:pPr>
               <w:spacing w:after="20" w:before="0"/>
             </w:pPr>
-            <w:hyperlink w:history="1" r:id="rIdkbogkovpk1y2rx1ibhh-p">
+            <w:hyperlink w:history="1" r:id="rIdhiamq_d5p766r8iu7qgz6">
               <w:r>
                 <w:rPr>
                   <w:rFonts w:ascii="Arial" w:cs="Arial" w:eastAsia="Arial" w:hAnsi="Arial"/>
@@ -31622,7 +31789,7 @@
               <w:spacing w:after="10" w:before="0"/>
               <w:ind w:left="120"/>
             </w:pPr>
-            <w:hyperlink w:history="1" r:id="rIdudrgvuwgjdxg1vzz3ntsm">
+            <w:hyperlink w:history="1" r:id="rIdyyge71ycqr4q-5h4dedrv">
               <w:r>
                 <w:rPr>
                   <w:rFonts w:ascii="Arial" w:cs="Arial" w:eastAsia="Arial" w:hAnsi="Arial"/>
@@ -31638,7 +31805,7 @@
         </w:tc>
         <w:tc>
           <w:tcPr>
-            <w:tcW w:type="dxa" w:w="2556"/>
+            <w:tcW w:type="dxa" w:w="3324"/>
             <w:shd w:fill="FFFFFF" w:color="auto" w:val="clear"/>
             <w:tcMar>
               <w:top w:type="dxa" w:w="60"/>
@@ -31708,7 +31875,7 @@
         </w:tc>
         <w:tc>
           <w:tcPr>
-            <w:tcW w:type="dxa" w:w="2556"/>
+            <w:tcW w:type="dxa" w:w="2300"/>
             <w:shd w:fill="F2F2F2" w:color="auto" w:val="clear"/>
             <w:tcMar>
               <w:top w:type="dxa" w:w="60"/>
@@ -31740,7 +31907,7 @@
         </w:tc>
         <w:tc>
           <w:tcPr>
-            <w:tcW w:type="dxa" w:w="2556"/>
+            <w:tcW w:type="dxa" w:w="2300"/>
             <w:shd w:fill="FFFFFF" w:color="auto" w:val="clear"/>
             <w:tcMar>
               <w:top w:type="dxa" w:w="60"/>

</xml_diff>